<commit_message>
subiendo plantillas para la minuta y contrato pre
</commit_message>
<xml_diff>
--- a/backend/app/plantillas/plantilla_contrato_preparatorio.docx
+++ b/backend/app/plantillas/plantilla_contrato_preparatorio.docx
@@ -324,7 +324,7 @@
           <w:b/>
           <w:color w:val="000000" w:themeColor="text1"/>
         </w:rPr>
-        <w:t>ORO</w:t>
+        <w:t>{{ proyecto_nombre }}</w:t>
       </w:r>
       <w:r>
         <w:rPr>
@@ -332,14 +332,13 @@
           <w:color w:val="000000" w:themeColor="text1"/>
           <w:spacing w:val="-7"/>
         </w:rPr>
-        <w:t xml:space="preserve"> </w:t>
-      </w:r>
-      <w:r>
-        <w:rPr>
-          <w:b/>
-          <w:color w:val="000000" w:themeColor="text1"/>
-        </w:rPr>
-        <w:t>VERDE”</w:t>
+      </w:r>
+      <w:r>
+        <w:rPr>
+          <w:b/>
+          <w:color w:val="000000" w:themeColor="text1"/>
+        </w:rPr>
+        <w:t>”</w:t>
       </w:r>
       <w:r>
         <w:rPr>
@@ -1384,7 +1383,7 @@
         <w:rPr>
           <w:color w:val="000000" w:themeColor="text1"/>
         </w:rPr>
-        <w:t>DECLARA TENER CONOCIMIENTO QUE EL “PROYECTO INMOBILIARIO ORO VERDE” PUEDE SER OBJETO DE EVENTUALES MODIFICACIONES QUE PUDIERAN INTRODUCIRSE A REQUERIMIENTO DE LA MUNICIPALIDAD COMPETENTE, ENTIDADES PRESTADORAS DE SERVICIOS O CUALQUIER OTRA INSTITUCIÓN QUE PUDIERA INTERVENIR EN EL DESARROLLO Y EJECUCIÓN DEL PROYECTO HASTA SU CULMINACIÓN Y FINAL RECEPCIÓN DE OBRAS.</w:t>
+        <w:t>DECLARA TENER CONOCIMIENTO QUE EL “PROYECTO INMOBILIARIO {{ proyecto_nombre }}” PUEDE SER OBJETO DE EVENTUALES MODIFICACIONES QUE PUDIERAN INTRODUCIRSE A REQUERIMIENTO DE LA MUNICIPALIDAD COMPETENTE, ENTIDADES PRESTADORAS DE SERVICIOS O CUALQUIER OTRA INSTITUCIÓN QUE PUDIERA INTERVENIR EN EL DESARROLLO Y EJECUCIÓN DEL PROYECTO HASTA SU CULMINACIÓN Y FINAL RECEPCIÓN DE OBRAS.</w:t>
       </w:r>
       <w:r>
         <w:rPr>
@@ -2147,7 +2146,7 @@
         <w:rPr>
           <w:sz w:val="20"/>
         </w:rPr>
-        <w:t>MONTO QUE "{{ comprador_denominacion }}" CANCELARÁ SIN INTERESES EN UN PLAZO DE {{ plazo_texto }}, ES DECIR CANCELARÁ COMO FECHA MÁXIMO EL {{ fecha_maxima_pago }}, CONCLUIDO CON EL PAGO, SE PROCEDERÁ CON LA FIRMA DE LA ESCRITURA PÚBLICA DE COMPRA VENTA DEL PREDIO DESCRITO EN LA CLAUSULA SEGUNDA. ASIMISMO, SI "{{ comprador_denominacion }}" NO CUMPLIERA CON PAGAR EL SALDO RESTANTE DENTRO DE LA FECHA PACTADA, DEBERÁ(N) ABONAR A LA EMPRESA INTERESES COMPENSATORIOS SOBRE EL MONTO DE LAS OBLIGACIONES VENCIDAS, SIN QUE SEA NECESARIA LA INTIMACIÓN PARA CONSTITUIRLO EN MORA, ASÍ COMO LAS COMISIONES DE COBRANZA QUE PUDIEREN GENERARSE EN ESTE SUPUESTO, AL DÍA DE REALIZACIÓN DEL PAGO. LOS INTERESES COMPENSATORIOS APLICABLES EN EL PRESENTE CASO SE CALCULARÁN APLICANDO UNA TASA EFECTIVA ANUAL DEL {{ tasa_interes_compensatorio }}%, AL VENCIMIENTO DEL PLAZO PARA EL PAGO, "{{ comprador_denominacion }}" RECONOCE QUE "LA PROMITENTE VENDEDORA" ESTÁ EN CONDICIONES DE REQUERIR EL PAGO. EN ESTE SENTIDO, "{{ comprador_denominacion }}" DECLARA ESTAR OBLIGADO(S) FRENTE A "LA PROMITENTE VENDEDORA", DESDE EL MISMO DÍA DE VENCIMIENTO DEL PAGO.</w:t>
+        <w:t>MONTO QUE "{{ comprador_denominacion }}" CANCELARÁ {{ texto_intereses }} EN UN PLAZO DE {{ plazo_texto }}, ES DECIR CANCELARÁ COMO FECHA MÁXIMO EL {{ fecha_maxima_pago }}, CONCLUIDO CON EL PAGO, SE PROCEDERÁ CON LA FIRMA DE LA ESCRITURA PÚBLICA DE COMPRA VENTA DEL PREDIO DESCRITO EN LA CLAUSULA SEGUNDA. ASIMISMO, SI "{{ comprador_denominacion }}" NO CUMPLIERA CON PAGAR EL SALDO RESTANTE DENTRO DE LA FECHA PACTADA, DEBERÁ(N) ABONAR A LA EMPRESA INTERESES COMPENSATORIOS SOBRE EL MONTO DE LAS OBLIGACIONES VENCIDAS, SIN QUE SEA NECESARIA LA INTIMACIÓN PARA CONSTITUIRLO EN MORA, ASÍ COMO LAS COMISIONES DE COBRANZA QUE PUDIEREN GENERARSE EN ESTE SUPUESTO, AL DÍA DE REALIZACIÓN DEL PAGO. LOS INTERESES COMPENSATORIOS APLICABLES EN EL PRESENTE CASO SE CALCULARÁN APLICANDO UNA TASA EFECTIVA ANUAL DEL {{ tasa_interes_compensatorio }}%, AL VENCIMIENTO DEL PLAZO PARA EL PAGO, "{{ comprador_denominacion }}" RECONOCE QUE "LA PROMITENTE VENDEDORA" ESTÁ EN CONDICIONES DE REQUERIR EL PAGO. EN ESTE SENTIDO, "{{ comprador_denominacion }}" DECLARA ESTAR OBLIGADO(S) FRENTE A "LA PROMITENTE VENDEDORA", DESDE EL MISMO DÍA DE VENCIMIENTO DEL PAGO.</w:t>
       </w:r>
     </w:p>
     <w:p>
@@ -3373,7 +3372,7 @@
           <w:sz w:val="20"/>
           <w:szCs w:val="20"/>
         </w:rPr>
-        <w:t>ORO</w:t>
+        <w:t>{{ proyecto_nombre }}</w:t>
       </w:r>
       <w:r>
         <w:rPr>
@@ -3382,15 +3381,14 @@
           <w:sz w:val="20"/>
           <w:szCs w:val="20"/>
         </w:rPr>
-        <w:t xml:space="preserve"> </w:t>
-      </w:r>
-      <w:r>
-        <w:rPr>
-          <w:color w:val="000000" w:themeColor="text1"/>
-          <w:sz w:val="20"/>
-          <w:szCs w:val="20"/>
-        </w:rPr>
-        <w:t>VERDE”,</w:t>
+      </w:r>
+      <w:r>
+        <w:rPr>
+          <w:color w:val="000000" w:themeColor="text1"/>
+          <w:sz w:val="20"/>
+          <w:szCs w:val="20"/>
+        </w:rPr>
+        <w:t>”,</w:t>
       </w:r>
       <w:r>
         <w:rPr>
@@ -7229,16 +7227,6 @@
           <w:szCs w:val="20"/>
         </w:rPr>
         <w:t xml:space="preserve">EN EL PRESENTE CONTRATO, AMBAS SE SOMETEN A LO ESTABLECIDO POR LAS NORMAS DEL CÓDIGO CIVIL Y DEMÁS DEL SISTEMA JURÍDICO QUE RESULTEN APLICABLES. </w:t>
-      </w:r>
-      <w:r>
-        <w:rPr>
-          <w:b/>
-          <w:color w:val="000000" w:themeColor="text1"/>
-          <w:sz w:val="20"/>
-          <w:szCs w:val="20"/>
-          <w:u w:val="single"/>
-        </w:rPr>
-        <w:t>INSERTO – MEDIO DE PAGO:</w:t>
       </w:r>
     </w:p>
     <w:p>
@@ -7315,6 +7303,30 @@
     </w:p>
     <w:p>
       <w:pPr>
+        <w:keepNext/>
+        <w:spacing w:before="160"/>
+        <w:ind w:left="568" w:right="4"/>
+        <w:jc w:val="both"/>
+        <w:rPr>
+          <w:b/>
+          <w:color w:val="000000" w:themeColor="text1"/>
+          <w:sz w:val="20"/>
+          <w:szCs w:val="20"/>
+        </w:rPr>
+      </w:pPr>
+      <w:r>
+        <w:rPr>
+          <w:b/>
+          <w:color w:val="000000" w:themeColor="text1"/>
+          <w:sz w:val="20"/>
+          <w:szCs w:val="20"/>
+          <w:u w:val="single"/>
+        </w:rPr>
+        <w:t>INSERTO – MEDIO DE PAGO:</w:t>
+      </w:r>
+    </w:p>
+    <w:p>
+      <w:pPr>
         <w:pStyle w:val="Textoindependiente"/>
         <w:ind w:left="0" w:right="4"/>
         <w:jc w:val="center"/>
@@ -7326,76 +7338,136 @@
       </w:pPr>
       <w:r>
         <w:rPr>
+          <w:b w:val="0"/>
+        </w:rPr>
+        <w:t>{%p if vouchers %}</w:t>
+      </w:r>
+    </w:p>
+    <w:p>
+      <w:pPr>
+        <w:pStyle w:val="Textoindependiente"/>
+        <w:ind w:left="0" w:right="4"/>
+        <w:jc w:val="center"/>
+        <w:rPr>
           <w:b/>
           <w:noProof/>
           <w:color w:val="000000" w:themeColor="text1"/>
         </w:rPr>
-        <w:lastRenderedPageBreak/>
-        <w:drawing>
-          <wp:anchor distT="0" distB="0" distL="114300" distR="114300" simplePos="0" relativeHeight="251662336" behindDoc="0" locked="0" layoutInCell="1" allowOverlap="1" wp14:anchorId="760BAC6F" wp14:editId="56520B2C">
-            <wp:simplePos x="0" y="0"/>
-            <wp:positionH relativeFrom="column">
-              <wp:posOffset>1701165</wp:posOffset>
-            </wp:positionH>
-            <wp:positionV relativeFrom="paragraph">
-              <wp:posOffset>-927100</wp:posOffset>
-            </wp:positionV>
-            <wp:extent cx="2343150" cy="2971800"/>
-            <wp:effectExtent l="0" t="0" r="0" b="0"/>
-            <wp:wrapNone/>
-            <wp:docPr id="1" name="Imagen 1"/>
-            <wp:cNvGraphicFramePr>
-              <a:graphicFrameLocks xmlns:a="http://schemas.openxmlformats.org/drawingml/2006/main" noChangeAspect="1"/>
-            </wp:cNvGraphicFramePr>
-            <a:graphic xmlns:a="http://schemas.openxmlformats.org/drawingml/2006/main">
-              <a:graphicData uri="http://schemas.openxmlformats.org/drawingml/2006/picture">
-                <pic:pic xmlns:pic="http://schemas.openxmlformats.org/drawingml/2006/picture">
-                  <pic:nvPicPr>
-                    <pic:cNvPr id="0" name="Picture 2"/>
-                    <pic:cNvPicPr>
-                      <a:picLocks noChangeAspect="1" noChangeArrowheads="1"/>
-                    </pic:cNvPicPr>
-                  </pic:nvPicPr>
-                  <pic:blipFill rotWithShape="1">
-                    <a:blip r:embed="rId7" cstate="print">
-                      <a:extLst>
-                        <a:ext uri="{28A0092B-C50C-407E-A947-70E740481C1C}">
-                          <a14:useLocalDpi xmlns:a14="http://schemas.microsoft.com/office/drawing/2010/main" val="0"/>
-                        </a:ext>
-                      </a:extLst>
-                    </a:blip>
-                    <a:srcRect t="13262" b="15397"/>
-                    <a:stretch/>
-                  </pic:blipFill>
-                  <pic:spPr bwMode="auto">
-                    <a:xfrm>
-                      <a:off x="0" y="0"/>
-                      <a:ext cx="2343150" cy="2971800"/>
-                    </a:xfrm>
-                    <a:prstGeom prst="rect">
-                      <a:avLst/>
-                    </a:prstGeom>
-                    <a:noFill/>
-                    <a:ln>
-                      <a:noFill/>
-                    </a:ln>
-                    <a:extLst>
-                      <a:ext uri="{53640926-AAD7-44D8-BBD7-CCE9431645EC}">
-                        <a14:shadowObscured xmlns:a14="http://schemas.microsoft.com/office/drawing/2010/main"/>
-                      </a:ext>
-                    </a:extLst>
-                  </pic:spPr>
-                </pic:pic>
-              </a:graphicData>
-            </a:graphic>
-            <wp14:sizeRelH relativeFrom="margin">
-              <wp14:pctWidth>0</wp14:pctWidth>
-            </wp14:sizeRelH>
-            <wp14:sizeRelV relativeFrom="margin">
-              <wp14:pctHeight>0</wp14:pctHeight>
-            </wp14:sizeRelV>
-          </wp:anchor>
-        </w:drawing>
+      </w:pPr>
+      <w:r>
+        <w:rPr>
+          <w:b w:val="0"/>
+        </w:rPr>
+        <w:t>{%p for v in vouchers %}</w:t>
+      </w:r>
+    </w:p>
+    <w:p>
+      <w:pPr>
+        <w:pStyle w:val="Textoindependiente"/>
+        <w:keepLines/>
+        <w:ind w:left="0" w:right="4"/>
+        <w:jc w:val="center"/>
+        <w:rPr>
+          <w:b/>
+          <w:noProof/>
+          <w:color w:val="000000" w:themeColor="text1"/>
+        </w:rPr>
+      </w:pPr>
+      <w:r>
+        <w:rPr>
+          <w:b w:val="0"/>
+        </w:rPr>
+        <w:t>{{ v }}</w:t>
+      </w:r>
+    </w:p>
+    <w:p>
+      <w:pPr>
+        <w:pStyle w:val="Textoindependiente"/>
+        <w:ind w:left="0" w:right="4"/>
+        <w:jc w:val="center"/>
+        <w:rPr>
+          <w:b/>
+          <w:noProof/>
+          <w:color w:val="000000" w:themeColor="text1"/>
+        </w:rPr>
+      </w:pPr>
+      <w:r>
+        <w:rPr>
+          <w:b w:val="0"/>
+        </w:rPr>
+        <w:t>{%p endfor %}</w:t>
+      </w:r>
+    </w:p>
+    <w:p>
+      <w:pPr>
+        <w:pStyle w:val="Textoindependiente"/>
+        <w:ind w:left="0" w:right="4"/>
+        <w:jc w:val="center"/>
+        <w:rPr>
+          <w:b/>
+          <w:noProof/>
+          <w:color w:val="000000" w:themeColor="text1"/>
+        </w:rPr>
+      </w:pPr>
+      <w:r>
+        <w:rPr>
+          <w:b w:val="0"/>
+        </w:rPr>
+        <w:t>{%p endif %}</w:t>
+      </w:r>
+    </w:p>
+    <w:p>
+      <w:pPr>
+        <w:pStyle w:val="Textoindependiente"/>
+        <w:ind w:left="0" w:right="4"/>
+        <w:jc w:val="center"/>
+        <w:rPr>
+          <w:b/>
+          <w:noProof/>
+          <w:color w:val="000000" w:themeColor="text1"/>
+        </w:rPr>
+      </w:pPr>
+      <w:r>
+        <w:rPr>
+          <w:b w:val="0"/>
+        </w:rPr>
+        <w:t>{%p if not vouchers %}</w:t>
+      </w:r>
+    </w:p>
+    <w:p>
+      <w:pPr>
+        <w:pStyle w:val="Textoindependiente"/>
+        <w:ind w:left="0" w:right="4"/>
+        <w:jc w:val="center"/>
+        <w:rPr>
+          <w:b/>
+          <w:noProof/>
+          <w:color w:val="000000" w:themeColor="text1"/>
+        </w:rPr>
+      </w:pPr>
+      <w:r>
+        <w:rPr>
+          <w:b/>
+        </w:rPr>
+        <w:t>(VOUCHER PENDIENTE DE ADJUNTAR)</w:t>
+      </w:r>
+    </w:p>
+    <w:p>
+      <w:pPr>
+        <w:pStyle w:val="Textoindependiente"/>
+        <w:ind w:left="0" w:right="4"/>
+        <w:jc w:val="center"/>
+        <w:rPr>
+          <w:b/>
+          <w:noProof/>
+          <w:color w:val="000000" w:themeColor="text1"/>
+        </w:rPr>
+      </w:pPr>
+      <w:r>
+        <w:rPr>
+          <w:b w:val="0"/>
+        </w:rPr>
+        <w:t>{%p endif %}</w:t>
       </w:r>
     </w:p>
     <w:p>
@@ -7565,6 +7637,7 @@
     <w:p>
       <w:pPr>
         <w:pStyle w:val="Textoindependiente"/>
+        <w:keepNext/>
         <w:ind w:right="4"/>
         <w:rPr>
           <w:color w:val="000000" w:themeColor="text1"/>
@@ -7579,6 +7652,7 @@
     <w:p>
       <w:pPr>
         <w:pStyle w:val="Textoindependiente"/>
+        <w:keepNext/>
         <w:ind w:left="4129"/>
         <w:jc w:val="left"/>
       </w:pPr>
@@ -7586,6 +7660,7 @@
     <w:p>
       <w:pPr>
         <w:pStyle w:val="Textoindependiente"/>
+        <w:keepNext/>
         <w:ind w:left="4129"/>
         <w:jc w:val="left"/>
         <w:rPr>
@@ -7600,6 +7675,7 @@
     <w:p>
       <w:pPr>
         <w:pStyle w:val="Textoindependiente"/>
+        <w:keepNext/>
         <w:ind w:right="4"/>
         <w:rPr>
           <w:color w:val="000000" w:themeColor="text1"/>
@@ -7609,6 +7685,7 @@
     <w:p>
       <w:pPr>
         <w:pStyle w:val="Textoindependiente"/>
+        <w:keepNext/>
         <w:ind w:left="4109" w:right="4"/>
         <w:rPr>
           <w:color w:val="000000" w:themeColor="text1"/>
@@ -7618,7 +7695,8 @@
     <w:p>
       <w:pPr>
         <w:pStyle w:val="Textoindependiente"/>
-        <w:ind w:left="0" w:right="4"/>
+        <w:keepNext/>
+        <w:ind w:right="4"/>
         <w:rPr>
           <w:color w:val="000000" w:themeColor="text1"/>
           <w:spacing w:val="-2"/>
@@ -7628,6 +7706,7 @@
     <w:p>
       <w:pPr>
         <w:pStyle w:val="Textoindependiente"/>
+        <w:keepNext/>
         <w:ind w:right="4"/>
         <w:rPr>
           <w:color w:val="000000" w:themeColor="text1"/>
@@ -7638,6 +7717,7 @@
     <w:p>
       <w:pPr>
         <w:pStyle w:val="Textoindependiente"/>
+        <w:keepNext/>
         <w:ind w:right="4"/>
         <w:rPr>
           <w:color w:val="000000" w:themeColor="text1"/>
@@ -7648,46 +7728,7 @@
     <w:p>
       <w:pPr>
         <w:pStyle w:val="Textoindependiente"/>
-        <w:ind w:right="4"/>
-        <w:rPr>
-          <w:color w:val="000000" w:themeColor="text1"/>
-          <w:spacing w:val="-2"/>
-        </w:rPr>
-      </w:pPr>
-    </w:p>
-    <w:p>
-      <w:pPr>
-        <w:pStyle w:val="Textoindependiente"/>
-        <w:ind w:right="4"/>
-        <w:rPr>
-          <w:color w:val="000000" w:themeColor="text1"/>
-          <w:spacing w:val="-2"/>
-        </w:rPr>
-      </w:pPr>
-    </w:p>
-    <w:p>
-      <w:pPr>
-        <w:pStyle w:val="Textoindependiente"/>
-        <w:ind w:right="4"/>
-        <w:rPr>
-          <w:color w:val="000000" w:themeColor="text1"/>
-          <w:spacing w:val="-2"/>
-        </w:rPr>
-      </w:pPr>
-    </w:p>
-    <w:p>
-      <w:pPr>
-        <w:pStyle w:val="Textoindependiente"/>
-        <w:ind w:right="4"/>
-        <w:rPr>
-          <w:color w:val="000000" w:themeColor="text1"/>
-          <w:spacing w:val="-2"/>
-        </w:rPr>
-      </w:pPr>
-    </w:p>
-    <w:p>
-      <w:pPr>
-        <w:pStyle w:val="Textoindependiente"/>
+        <w:keepNext/>
         <w:ind w:left="0" w:right="4"/>
         <w:rPr>
           <w:color w:val="000000" w:themeColor="text1"/>
@@ -7876,87 +7917,6 @@
         <w:tab/>
         <w:t xml:space="preserve">       </w:t>
       </w:r>
-    </w:p>
-    <w:p>
-      <w:pPr>
-        <w:pStyle w:val="Textoindependiente"/>
-        <w:ind w:left="0" w:right="4"/>
-        <w:rPr>
-          <w:color w:val="000000" w:themeColor="text1"/>
-          <w:spacing w:val="-2"/>
-        </w:rPr>
-      </w:pPr>
-    </w:p>
-    <w:p>
-      <w:pPr>
-        <w:pStyle w:val="Textoindependiente"/>
-        <w:ind w:left="0" w:right="4"/>
-        <w:rPr>
-          <w:color w:val="000000" w:themeColor="text1"/>
-          <w:spacing w:val="-2"/>
-        </w:rPr>
-      </w:pPr>
-    </w:p>
-    <w:p>
-      <w:pPr>
-        <w:pStyle w:val="Textoindependiente"/>
-        <w:ind w:left="0" w:right="4"/>
-        <w:rPr>
-          <w:color w:val="000000" w:themeColor="text1"/>
-          <w:spacing w:val="-2"/>
-        </w:rPr>
-      </w:pPr>
-    </w:p>
-    <w:p>
-      <w:pPr>
-        <w:pStyle w:val="Textoindependiente"/>
-        <w:ind w:left="0" w:right="4"/>
-        <w:rPr>
-          <w:color w:val="000000" w:themeColor="text1"/>
-          <w:spacing w:val="-2"/>
-        </w:rPr>
-      </w:pPr>
-    </w:p>
-    <w:p>
-      <w:pPr>
-        <w:pStyle w:val="Textoindependiente"/>
-        <w:ind w:left="0" w:right="4"/>
-        <w:rPr>
-          <w:color w:val="000000" w:themeColor="text1"/>
-          <w:spacing w:val="-2"/>
-        </w:rPr>
-      </w:pPr>
-    </w:p>
-    <w:p>
-      <w:pPr>
-        <w:pStyle w:val="Textoindependiente"/>
-        <w:ind w:left="0" w:right="4"/>
-        <w:rPr>
-          <w:color w:val="000000" w:themeColor="text1"/>
-          <w:spacing w:val="-2"/>
-        </w:rPr>
-      </w:pPr>
-    </w:p>
-    <w:p>
-      <w:pPr>
-        <w:pStyle w:val="Textoindependiente"/>
-        <w:ind w:left="0" w:right="4"/>
-        <w:rPr>
-          <w:color w:val="000000" w:themeColor="text1"/>
-          <w:spacing w:val="-2"/>
-        </w:rPr>
-      </w:pPr>
-    </w:p>
-    <w:p>
-      <w:pPr>
-        <w:pStyle w:val="Textoindependiente"/>
-        <w:ind w:left="720" w:right="4" w:hanging="152"/>
-        <w:jc w:val="center"/>
-        <w:rPr>
-          <w:color w:val="000000" w:themeColor="text1"/>
-          <w:spacing w:val="-2"/>
-        </w:rPr>
-      </w:pPr>
     </w:p>
     <w:sectPr>
       <w:pgSz w:w="11910" w:h="16850"/>

</xml_diff>

<commit_message>
Las plantillas de contrato preparatotio y minuto se basa en los actualizados
</commit_message>
<xml_diff>
--- a/backend/app/plantillas/plantilla_contrato_preparatorio.docx
+++ b/backend/app/plantillas/plantilla_contrato_preparatorio.docx
@@ -98,7 +98,7 @@
         <w:rPr>
           <w:sz w:val="20"/>
         </w:rPr>
-        <w:t>CONSTE POR EL PRESENTE DOCUMENTO EL CONTRATO PREPARATORIO DE COMPRA VENTA, QUE CELEBRAN DE UNA PARTE: LA EMPRESA {{ empresa_razon_social }} CON R.U.C. Nº {{ empresa_ruc }}, DEBIDAMENTE REPRESENTADO POR SU GERENTE GENERAL {{ empresa_representante_nombre }}, IDENTIFICADO CON DNI N° {{ empresa_representante_dni }}, FACULTADO SEGÚN PODERES INSCRITOS EN LA PARTIDA N° {{ empresa_partida_poderes }} DEL REGISTRO DE PERSONAS JURÍDICAS DE LA OFICINA REGISTRAL DE {{ empresa_oficina_registral }}, CON DOMICILIO EN {{ empresa_domicilio }}, A QUIÉN EN ADELANTE SE LE DENOMINARÁ "LA PROMITENTE VENDEDORA", Y DE LA OTRA PARTE: {{ comprador_bloque }}, {{ comprador_quien }} EN ADELANTE {{ comprador_se_le }} DENOMINARÁ "{{ comprador_denominacion }}", EN LOS TÉRMINOS SIGUIENTES:</w:t>
+        <w:t>CONSTE POR EL PRESENTE DOCUMENTO EL CONTRATO PREPARATORIO DE COMPRA VENTA, QUE CELEBRAN DE UNA PARTE: LA EMPRESA {{ empresa_razon_social }} CON R.U.C. Nº {{ empresa_ruc }}, DEBIDAMENTE REPRESENTADO POR {{ empresa_representante_bloque }}, A QUIÉN EN ADELANTE SE LE DENOMINARÁ "LA PROMITENTE VENDEDORA", Y DE LA OTRA PARTE: {{ comprador_bloque }}, {{ comprador_quien }} EN ADELANTE {{ comprador_se_le }} DENOMINARÁ "{{ comprador_denominacion }}", EN LOS TÉRMINOS SIGUIENTES:</w:t>
       </w:r>
     </w:p>
     <w:p>
@@ -906,64 +906,64 @@
         <w:rPr>
           <w:color w:val="000000" w:themeColor="text1"/>
         </w:rPr>
-        <w:t>“</w:t>
-      </w:r>
-      <w:r>
-        <w:rPr>
-          <w:b/>
-          <w:color w:val="000000" w:themeColor="text1"/>
-        </w:rPr>
-        <w:t>EL</w:t>
-      </w:r>
-      <w:r>
-        <w:rPr>
-          <w:b/>
-          <w:color w:val="000000" w:themeColor="text1"/>
-        </w:rPr>
-        <w:t xml:space="preserve"> PROMINENTE COMPRADOR</w:t>
-      </w:r>
-      <w:r>
-        <w:rPr>
-          <w:b/>
-          <w:color w:val="000000" w:themeColor="text1"/>
-        </w:rPr>
-        <w:t xml:space="preserve">” </w:t>
-      </w:r>
-      <w:r>
-        <w:rPr>
-          <w:color w:val="000000" w:themeColor="text1"/>
-        </w:rPr>
-        <w:t>SE ENCUENTRA</w:t>
-      </w:r>
-      <w:r>
-        <w:rPr>
-          <w:color w:val="000000" w:themeColor="text1"/>
-        </w:rPr>
-        <w:t>N</w:t>
-      </w:r>
-      <w:r>
-        <w:rPr>
-          <w:color w:val="000000" w:themeColor="text1"/>
-        </w:rPr>
-        <w:t xml:space="preserve"> INTERESA</w:t>
-      </w:r>
-      <w:r>
-        <w:rPr>
-          <w:color w:val="000000" w:themeColor="text1"/>
-        </w:rPr>
-        <w:t>D</w:t>
-      </w:r>
-      <w:r>
-        <w:rPr>
-          <w:color w:val="000000" w:themeColor="text1"/>
-        </w:rPr>
-        <w:t>O</w:t>
-      </w:r>
-      <w:r>
-        <w:rPr>
-          <w:color w:val="000000" w:themeColor="text1"/>
-        </w:rPr>
-        <w:t>S</w:t>
+        <w:t xml:space="preserve">“{{ comprador_denominacion }}”</w:t>
+      </w:r>
+      <w:r>
+        <w:rPr>
+          <w:b/>
+          <w:color w:val="000000" w:themeColor="text1"/>
+        </w:rPr>
+        <w:t/>
+      </w:r>
+      <w:r>
+        <w:rPr>
+          <w:b/>
+          <w:color w:val="000000" w:themeColor="text1"/>
+        </w:rPr>
+        <w:t xml:space="preserve"/>
+      </w:r>
+      <w:r>
+        <w:rPr>
+          <w:b/>
+          <w:color w:val="000000" w:themeColor="text1"/>
+        </w:rPr>
+        <w:t xml:space="preserve"> </w:t>
+      </w:r>
+      <w:r>
+        <w:rPr>
+          <w:color w:val="000000" w:themeColor="text1"/>
+        </w:rPr>
+        <w:t xml:space="preserve">SE ENCUENTRA{{ comprador_n }} INTERESAD{{ comprador_adj }}</w:t>
+      </w:r>
+      <w:r>
+        <w:rPr>
+          <w:color w:val="000000" w:themeColor="text1"/>
+        </w:rPr>
+        <w:t/>
+      </w:r>
+      <w:r>
+        <w:rPr>
+          <w:color w:val="000000" w:themeColor="text1"/>
+        </w:rPr>
+        <w:t xml:space="preserve"/>
+      </w:r>
+      <w:r>
+        <w:rPr>
+          <w:color w:val="000000" w:themeColor="text1"/>
+        </w:rPr>
+        <w:t/>
+      </w:r>
+      <w:r>
+        <w:rPr>
+          <w:color w:val="000000" w:themeColor="text1"/>
+        </w:rPr>
+        <w:t/>
+      </w:r>
+      <w:r>
+        <w:rPr>
+          <w:color w:val="000000" w:themeColor="text1"/>
+        </w:rPr>
+        <w:t xml:space="preserve"/>
       </w:r>
       <w:r>
         <w:rPr>
@@ -1021,39 +1021,39 @@
         <w:rPr>
           <w:color w:val="000000" w:themeColor="text1"/>
         </w:rPr>
-        <w:t>VOLUNTARIAMENTE</w:t>
+        <w:t xml:space="preserve">VOLUNTARIAMENTE DECIDE{{ comprador_n }} ADQUIRIR</w:t>
       </w:r>
       <w:r>
         <w:rPr>
           <w:color w:val="000000" w:themeColor="text1"/>
           <w:spacing w:val="-30"/>
         </w:rPr>
-        <w:t xml:space="preserve"> </w:t>
-      </w:r>
-      <w:r>
-        <w:rPr>
-          <w:color w:val="000000" w:themeColor="text1"/>
-        </w:rPr>
-        <w:t>DECIDE</w:t>
-      </w:r>
-      <w:r>
-        <w:rPr>
-          <w:color w:val="000000" w:themeColor="text1"/>
-        </w:rPr>
-        <w:t>N</w:t>
+        <w:t xml:space="preserve"/>
+      </w:r>
+      <w:r>
+        <w:rPr>
+          <w:color w:val="000000" w:themeColor="text1"/>
+        </w:rPr>
+        <w:t/>
+      </w:r>
+      <w:r>
+        <w:rPr>
+          <w:color w:val="000000" w:themeColor="text1"/>
+        </w:rPr>
+        <w:t/>
       </w:r>
       <w:r>
         <w:rPr>
           <w:color w:val="000000" w:themeColor="text1"/>
           <w:spacing w:val="-30"/>
         </w:rPr>
-        <w:t xml:space="preserve"> </w:t>
-      </w:r>
-      <w:r>
-        <w:rPr>
-          <w:color w:val="000000" w:themeColor="text1"/>
-        </w:rPr>
-        <w:t>ADQUIRIR</w:t>
+        <w:t xml:space="preserve"/>
+      </w:r>
+      <w:r>
+        <w:rPr>
+          <w:color w:val="000000" w:themeColor="text1"/>
+        </w:rPr>
+        <w:t xml:space="preserve"/>
       </w:r>
       <w:r>
         <w:rPr>
@@ -1356,6 +1356,59 @@
           <w:b/>
           <w:color w:val="000000" w:themeColor="text1"/>
         </w:rPr>
+        <w:t xml:space="preserve">“{{ comprador_denominacion }}” DECLARA{{ comprador_n }}</w:t>
+      </w:r>
+      <w:r>
+        <w:rPr>
+          <w:b/>
+          <w:color w:val="000000" w:themeColor="text1"/>
+        </w:rPr>
+        <w:t/>
+      </w:r>
+      <w:r>
+        <w:rPr>
+          <w:b/>
+          <w:color w:val="000000" w:themeColor="text1"/>
+        </w:rPr>
+        <w:t xml:space="preserve"/>
+      </w:r>
+      <w:r>
+        <w:rPr>
+          <w:b/>
+          <w:color w:val="000000" w:themeColor="text1"/>
+        </w:rPr>
+        <w:t xml:space="preserve"/>
+      </w:r>
+      <w:r>
+        <w:rPr>
+          <w:color w:val="000000" w:themeColor="text1"/>
+        </w:rPr>
+        <w:t xml:space="preserve"> TENER CONOCIMIENTO QUE EL “PROYECTO INMOBILIARIO {{ proyecto_nombre }}” PUEDE SER OBJETO DE EVENTUALES MODIFICACIONES QUE PUDIERAN INTRODUCIRSE A REQUERIMIENTO DE LA MUNICIPALIDAD COMPETENTE, ENTIDADES PRESTADORAS DE SERVICIOS O CUALQUIER OTRA INSTITUCIÓN QUE PUDIERA INTERVENIR EN EL DESARROLLO Y EJECUCIÓN DEL PROYECTO HASTA SU CULMINACIÓN Y FINAL RECEPCIÓN DE OBRAS.</w:t>
+      </w:r>
+      <w:r>
+        <w:rPr>
+          <w:color w:val="000000" w:themeColor="text1"/>
+          <w:spacing w:val="-23"/>
+        </w:rPr>
+        <w:t xml:space="preserve"> </w:t>
+      </w:r>
+      <w:r>
+        <w:rPr>
+          <w:color w:val="000000" w:themeColor="text1"/>
+        </w:rPr>
+        <w:t>ASIMISMO,</w:t>
+      </w:r>
+      <w:r>
+        <w:rPr>
+          <w:color w:val="000000" w:themeColor="text1"/>
+          <w:spacing w:val="-23"/>
+        </w:rPr>
+        <w:t xml:space="preserve"> </w:t>
+      </w:r>
+      <w:r>
+        <w:rPr>
+          <w:color w:val="000000" w:themeColor="text1"/>
+        </w:rPr>
         <w:t>“</w:t>
       </w:r>
       <w:r>
@@ -1363,30 +1416,26 @@
           <w:b/>
           <w:color w:val="000000" w:themeColor="text1"/>
         </w:rPr>
-        <w:t>EL</w:t>
-      </w:r>
-      <w:r>
-        <w:rPr>
-          <w:b/>
-          <w:color w:val="000000" w:themeColor="text1"/>
-        </w:rPr>
-        <w:t xml:space="preserve"> PROMINENTE COMPRADOR</w:t>
-      </w:r>
-      <w:r>
-        <w:rPr>
-          <w:b/>
-          <w:color w:val="000000" w:themeColor="text1"/>
-        </w:rPr>
-        <w:t xml:space="preserve">” </w:t>
-      </w:r>
-      <w:r>
-        <w:rPr>
-          <w:color w:val="000000" w:themeColor="text1"/>
-        </w:rPr>
-        <w:t>DECLARA TENER CONOCIMIENTO QUE EL “PROYECTO INMOBILIARIO {{ proyecto_nombre }}” PUEDE SER OBJETO DE EVENTUALES MODIFICACIONES QUE PUDIERAN INTRODUCIRSE A REQUERIMIENTO DE LA MUNICIPALIDAD COMPETENTE, ENTIDADES PRESTADORAS DE SERVICIOS O CUALQUIER OTRA INSTITUCIÓN QUE PUDIERA INTERVENIR EN EL DESARROLLO Y EJECUCIÓN DEL PROYECTO HASTA SU CULMINACIÓN Y FINAL RECEPCIÓN DE OBRAS.</w:t>
-      </w:r>
-      <w:r>
-        <w:rPr>
+        <w:t>LA</w:t>
+      </w:r>
+      <w:r>
+        <w:rPr>
+          <w:b/>
+          <w:color w:val="000000" w:themeColor="text1"/>
+          <w:spacing w:val="-21"/>
+        </w:rPr>
+        <w:t xml:space="preserve"> </w:t>
+      </w:r>
+      <w:r>
+        <w:rPr>
+          <w:b/>
+          <w:color w:val="000000" w:themeColor="text1"/>
+        </w:rPr>
+        <w:t>PROMITENTE</w:t>
+      </w:r>
+      <w:r>
+        <w:rPr>
+          <w:b/>
           <w:color w:val="000000" w:themeColor="text1"/>
           <w:spacing w:val="-23"/>
         </w:rPr>
@@ -1394,9 +1443,24 @@
       </w:r>
       <w:r>
         <w:rPr>
-          <w:color w:val="000000" w:themeColor="text1"/>
-        </w:rPr>
-        <w:t>ASIMISMO,</w:t>
+          <w:b/>
+          <w:color w:val="000000" w:themeColor="text1"/>
+        </w:rPr>
+        <w:t>VENDEDORA”</w:t>
+      </w:r>
+      <w:r>
+        <w:rPr>
+          <w:b/>
+          <w:color w:val="000000" w:themeColor="text1"/>
+          <w:spacing w:val="-21"/>
+        </w:rPr>
+        <w:t xml:space="preserve"> </w:t>
+      </w:r>
+      <w:r>
+        <w:rPr>
+          <w:color w:val="000000" w:themeColor="text1"/>
+        </w:rPr>
+        <w:t>DECLARA</w:t>
       </w:r>
       <w:r>
         <w:rPr>
@@ -1409,33 +1473,23 @@
         <w:rPr>
           <w:color w:val="000000" w:themeColor="text1"/>
         </w:rPr>
-        <w:t>“</w:t>
-      </w:r>
-      <w:r>
-        <w:rPr>
-          <w:b/>
+        <w:t>QUE</w:t>
+      </w:r>
+      <w:r>
+        <w:rPr>
+          <w:color w:val="000000" w:themeColor="text1"/>
+          <w:spacing w:val="-21"/>
+        </w:rPr>
+        <w:t xml:space="preserve"> </w:t>
+      </w:r>
+      <w:r>
+        <w:rPr>
           <w:color w:val="000000" w:themeColor="text1"/>
         </w:rPr>
         <w:t>LA</w:t>
       </w:r>
       <w:r>
         <w:rPr>
-          <w:b/>
-          <w:color w:val="000000" w:themeColor="text1"/>
-          <w:spacing w:val="-21"/>
-        </w:rPr>
-        <w:t xml:space="preserve"> </w:t>
-      </w:r>
-      <w:r>
-        <w:rPr>
-          <w:b/>
-          <w:color w:val="000000" w:themeColor="text1"/>
-        </w:rPr>
-        <w:t>PROMITENTE</w:t>
-      </w:r>
-      <w:r>
-        <w:rPr>
-          <w:b/>
           <w:color w:val="000000" w:themeColor="text1"/>
           <w:spacing w:val="-23"/>
         </w:rPr>
@@ -1443,29 +1497,261 @@
       </w:r>
       <w:r>
         <w:rPr>
-          <w:b/>
-          <w:color w:val="000000" w:themeColor="text1"/>
-        </w:rPr>
-        <w:t>VENDEDORA”</w:t>
-      </w:r>
-      <w:r>
-        <w:rPr>
-          <w:b/>
-          <w:color w:val="000000" w:themeColor="text1"/>
-          <w:spacing w:val="-21"/>
-        </w:rPr>
-        <w:t xml:space="preserve"> </w:t>
-      </w:r>
-      <w:r>
-        <w:rPr>
-          <w:color w:val="000000" w:themeColor="text1"/>
-        </w:rPr>
-        <w:t>DECLARA</w:t>
-      </w:r>
-      <w:r>
-        <w:rPr>
-          <w:color w:val="000000" w:themeColor="text1"/>
-          <w:spacing w:val="-23"/>
+          <w:color w:val="000000" w:themeColor="text1"/>
+        </w:rPr>
+        <w:t>NUMERACIÓN QUE</w:t>
+      </w:r>
+      <w:r>
+        <w:rPr>
+          <w:color w:val="000000" w:themeColor="text1"/>
+          <w:spacing w:val="-30"/>
+        </w:rPr>
+        <w:t xml:space="preserve"> </w:t>
+      </w:r>
+      <w:r>
+        <w:rPr>
+          <w:color w:val="000000" w:themeColor="text1"/>
+        </w:rPr>
+        <w:t>SE</w:t>
+      </w:r>
+      <w:r>
+        <w:rPr>
+          <w:color w:val="000000" w:themeColor="text1"/>
+          <w:spacing w:val="-30"/>
+        </w:rPr>
+        <w:t xml:space="preserve"> </w:t>
+      </w:r>
+      <w:r>
+        <w:rPr>
+          <w:color w:val="000000" w:themeColor="text1"/>
+        </w:rPr>
+        <w:t>ASIGNA</w:t>
+      </w:r>
+      <w:r>
+        <w:rPr>
+          <w:color w:val="000000" w:themeColor="text1"/>
+          <w:spacing w:val="-31"/>
+        </w:rPr>
+        <w:t xml:space="preserve"> </w:t>
+      </w:r>
+      <w:r>
+        <w:rPr>
+          <w:color w:val="000000" w:themeColor="text1"/>
+        </w:rPr>
+        <w:t>AL</w:t>
+      </w:r>
+      <w:r>
+        <w:rPr>
+          <w:color w:val="000000" w:themeColor="text1"/>
+          <w:spacing w:val="-29"/>
+        </w:rPr>
+        <w:t xml:space="preserve"> </w:t>
+      </w:r>
+      <w:r>
+        <w:rPr>
+          <w:color w:val="000000" w:themeColor="text1"/>
+        </w:rPr>
+        <w:t>INMUEBLE</w:t>
+      </w:r>
+      <w:r>
+        <w:rPr>
+          <w:color w:val="000000" w:themeColor="text1"/>
+          <w:spacing w:val="-30"/>
+        </w:rPr>
+        <w:t xml:space="preserve"> </w:t>
+      </w:r>
+      <w:r>
+        <w:rPr>
+          <w:color w:val="000000" w:themeColor="text1"/>
+        </w:rPr>
+        <w:t>SEGÚN</w:t>
+      </w:r>
+      <w:r>
+        <w:rPr>
+          <w:color w:val="000000" w:themeColor="text1"/>
+          <w:spacing w:val="-30"/>
+        </w:rPr>
+        <w:t xml:space="preserve"> </w:t>
+      </w:r>
+      <w:r>
+        <w:rPr>
+          <w:color w:val="000000" w:themeColor="text1"/>
+        </w:rPr>
+        <w:t>SE</w:t>
+      </w:r>
+      <w:r>
+        <w:rPr>
+          <w:color w:val="000000" w:themeColor="text1"/>
+          <w:spacing w:val="-29"/>
+        </w:rPr>
+        <w:t xml:space="preserve"> </w:t>
+      </w:r>
+      <w:r>
+        <w:rPr>
+          <w:color w:val="000000" w:themeColor="text1"/>
+        </w:rPr>
+        <w:t>INDICA</w:t>
+      </w:r>
+      <w:r>
+        <w:rPr>
+          <w:color w:val="000000" w:themeColor="text1"/>
+          <w:spacing w:val="-28"/>
+        </w:rPr>
+        <w:t xml:space="preserve"> </w:t>
+      </w:r>
+      <w:r>
+        <w:rPr>
+          <w:color w:val="000000" w:themeColor="text1"/>
+        </w:rPr>
+        <w:t>PREVIAMENTE,</w:t>
+      </w:r>
+      <w:r>
+        <w:rPr>
+          <w:color w:val="000000" w:themeColor="text1"/>
+          <w:spacing w:val="-30"/>
+        </w:rPr>
+        <w:t xml:space="preserve"> </w:t>
+      </w:r>
+      <w:r>
+        <w:rPr>
+          <w:color w:val="000000" w:themeColor="text1"/>
+        </w:rPr>
+        <w:t>ES</w:t>
+      </w:r>
+      <w:r>
+        <w:rPr>
+          <w:color w:val="000000" w:themeColor="text1"/>
+          <w:spacing w:val="-30"/>
+        </w:rPr>
+        <w:t xml:space="preserve"> </w:t>
+      </w:r>
+      <w:r>
+        <w:rPr>
+          <w:color w:val="000000" w:themeColor="text1"/>
+        </w:rPr>
+        <w:t>REFERENCIAL Y ESTÁ SUJETA A VARIACIÓN Y/O MODIFICACIÓN SEGÚN REQUERIMIENTO DEL PROYECTO</w:t>
+      </w:r>
+      <w:r>
+        <w:rPr>
+          <w:color w:val="000000" w:themeColor="text1"/>
+          <w:spacing w:val="-9"/>
+        </w:rPr>
+        <w:t xml:space="preserve"> </w:t>
+      </w:r>
+      <w:r>
+        <w:rPr>
+          <w:color w:val="000000" w:themeColor="text1"/>
+        </w:rPr>
+        <w:t>Y/O</w:t>
+      </w:r>
+      <w:r>
+        <w:rPr>
+          <w:color w:val="000000" w:themeColor="text1"/>
+          <w:spacing w:val="-6"/>
+        </w:rPr>
+        <w:t xml:space="preserve"> </w:t>
+      </w:r>
+      <w:r>
+        <w:rPr>
+          <w:color w:val="000000" w:themeColor="text1"/>
+        </w:rPr>
+        <w:t>CERTIFICADO</w:t>
+      </w:r>
+      <w:r>
+        <w:rPr>
+          <w:color w:val="000000" w:themeColor="text1"/>
+          <w:spacing w:val="-7"/>
+        </w:rPr>
+        <w:t xml:space="preserve"> </w:t>
+      </w:r>
+      <w:r>
+        <w:rPr>
+          <w:color w:val="000000" w:themeColor="text1"/>
+        </w:rPr>
+        <w:t>DE</w:t>
+      </w:r>
+      <w:r>
+        <w:rPr>
+          <w:color w:val="000000" w:themeColor="text1"/>
+          <w:spacing w:val="-6"/>
+        </w:rPr>
+        <w:t xml:space="preserve"> </w:t>
+      </w:r>
+      <w:r>
+        <w:rPr>
+          <w:color w:val="000000" w:themeColor="text1"/>
+        </w:rPr>
+        <w:t>NUMERACIÓN</w:t>
+      </w:r>
+      <w:r>
+        <w:rPr>
+          <w:color w:val="000000" w:themeColor="text1"/>
+          <w:spacing w:val="-8"/>
+        </w:rPr>
+        <w:t xml:space="preserve"> </w:t>
+      </w:r>
+      <w:r>
+        <w:rPr>
+          <w:color w:val="000000" w:themeColor="text1"/>
+        </w:rPr>
+        <w:t>EMITIDO</w:t>
+      </w:r>
+      <w:r>
+        <w:rPr>
+          <w:color w:val="000000" w:themeColor="text1"/>
+          <w:spacing w:val="-8"/>
+        </w:rPr>
+        <w:t xml:space="preserve"> </w:t>
+      </w:r>
+      <w:r>
+        <w:rPr>
+          <w:color w:val="000000" w:themeColor="text1"/>
+        </w:rPr>
+        <w:t>POR</w:t>
+      </w:r>
+      <w:r>
+        <w:rPr>
+          <w:color w:val="000000" w:themeColor="text1"/>
+          <w:spacing w:val="-6"/>
+        </w:rPr>
+        <w:t xml:space="preserve"> </w:t>
+      </w:r>
+      <w:r>
+        <w:rPr>
+          <w:color w:val="000000" w:themeColor="text1"/>
+        </w:rPr>
+        <w:t>LA</w:t>
+      </w:r>
+      <w:r>
+        <w:rPr>
+          <w:color w:val="000000" w:themeColor="text1"/>
+          <w:spacing w:val="-9"/>
+        </w:rPr>
+        <w:t xml:space="preserve"> </w:t>
+      </w:r>
+      <w:r>
+        <w:rPr>
+          <w:color w:val="000000" w:themeColor="text1"/>
+        </w:rPr>
+        <w:t>MUNICIPALIDAD COMPETENTE,</w:t>
+      </w:r>
+      <w:r>
+        <w:rPr>
+          <w:color w:val="000000" w:themeColor="text1"/>
+          <w:spacing w:val="-30"/>
+        </w:rPr>
+        <w:t xml:space="preserve"> </w:t>
+      </w:r>
+      <w:r>
+        <w:rPr>
+          <w:color w:val="000000" w:themeColor="text1"/>
+        </w:rPr>
+        <w:t>CIRCUNSTANCIA</w:t>
+      </w:r>
+      <w:r>
+        <w:rPr>
+          <w:color w:val="000000" w:themeColor="text1"/>
+          <w:spacing w:val="-29"/>
         </w:rPr>
         <w:t xml:space="preserve"> </w:t>
       </w:r>
@@ -1478,32 +1764,6 @@
       <w:r>
         <w:rPr>
           <w:color w:val="000000" w:themeColor="text1"/>
-          <w:spacing w:val="-21"/>
-        </w:rPr>
-        <w:t xml:space="preserve"> </w:t>
-      </w:r>
-      <w:r>
-        <w:rPr>
-          <w:color w:val="000000" w:themeColor="text1"/>
-        </w:rPr>
-        <w:t>LA</w:t>
-      </w:r>
-      <w:r>
-        <w:rPr>
-          <w:color w:val="000000" w:themeColor="text1"/>
-          <w:spacing w:val="-23"/>
-        </w:rPr>
-        <w:t xml:space="preserve"> </w:t>
-      </w:r>
-      <w:r>
-        <w:rPr>
-          <w:color w:val="000000" w:themeColor="text1"/>
-        </w:rPr>
-        <w:t>NUMERACIÓN QUE</w:t>
-      </w:r>
-      <w:r>
-        <w:rPr>
-          <w:color w:val="000000" w:themeColor="text1"/>
           <w:spacing w:val="-30"/>
         </w:rPr>
         <w:t xml:space="preserve"> </w:t>
@@ -1512,318 +1772,58 @@
         <w:rPr>
           <w:color w:val="000000" w:themeColor="text1"/>
         </w:rPr>
-        <w:t>SE</w:t>
-      </w:r>
-      <w:r>
-        <w:rPr>
-          <w:color w:val="000000" w:themeColor="text1"/>
-          <w:spacing w:val="-30"/>
-        </w:rPr>
-        <w:t xml:space="preserve"> </w:t>
-      </w:r>
-      <w:r>
-        <w:rPr>
-          <w:color w:val="000000" w:themeColor="text1"/>
-        </w:rPr>
-        <w:t>ASIGNA</w:t>
-      </w:r>
-      <w:r>
-        <w:rPr>
-          <w:color w:val="000000" w:themeColor="text1"/>
-          <w:spacing w:val="-31"/>
-        </w:rPr>
-        <w:t xml:space="preserve"> </w:t>
-      </w:r>
-      <w:r>
-        <w:rPr>
-          <w:color w:val="000000" w:themeColor="text1"/>
-        </w:rPr>
-        <w:t>AL</w:t>
-      </w:r>
-      <w:r>
-        <w:rPr>
-          <w:color w:val="000000" w:themeColor="text1"/>
-          <w:spacing w:val="-29"/>
-        </w:rPr>
-        <w:t xml:space="preserve"> </w:t>
-      </w:r>
-      <w:r>
-        <w:rPr>
-          <w:color w:val="000000" w:themeColor="text1"/>
-        </w:rPr>
-        <w:t>INMUEBLE</w:t>
-      </w:r>
-      <w:r>
-        <w:rPr>
-          <w:color w:val="000000" w:themeColor="text1"/>
-          <w:spacing w:val="-30"/>
-        </w:rPr>
-        <w:t xml:space="preserve"> </w:t>
-      </w:r>
-      <w:r>
-        <w:rPr>
-          <w:color w:val="000000" w:themeColor="text1"/>
-        </w:rPr>
-        <w:t>SEGÚN</w:t>
-      </w:r>
-      <w:r>
-        <w:rPr>
-          <w:color w:val="000000" w:themeColor="text1"/>
-          <w:spacing w:val="-30"/>
-        </w:rPr>
-        <w:t xml:space="preserve"> </w:t>
-      </w:r>
-      <w:r>
-        <w:rPr>
-          <w:color w:val="000000" w:themeColor="text1"/>
-        </w:rPr>
-        <w:t>SE</w:t>
-      </w:r>
-      <w:r>
-        <w:rPr>
-          <w:color w:val="000000" w:themeColor="text1"/>
-          <w:spacing w:val="-29"/>
-        </w:rPr>
-        <w:t xml:space="preserve"> </w:t>
-      </w:r>
-      <w:r>
-        <w:rPr>
-          <w:color w:val="000000" w:themeColor="text1"/>
-        </w:rPr>
-        <w:t>INDICA</w:t>
-      </w:r>
-      <w:r>
-        <w:rPr>
+        <w:t xml:space="preserve">“{{ comprador_denominacion }}” DECLARA{{ comprador_n }}</w:t>
+      </w:r>
+      <w:proofErr w:type="gramStart"/>
+      <w:r>
+        <w:rPr>
+          <w:b/>
+          <w:color w:val="000000" w:themeColor="text1"/>
+        </w:rPr>
+        <w:t/>
+      </w:r>
+      <w:r>
+        <w:rPr>
+          <w:b/>
+          <w:color w:val="000000" w:themeColor="text1"/>
+        </w:rPr>
+        <w:t xml:space="preserve"/>
+      </w:r>
+      <w:r>
+        <w:rPr>
+          <w:b/>
+          <w:color w:val="000000" w:themeColor="text1"/>
+        </w:rPr>
+        <w:t xml:space="preserve"/>
+      </w:r>
+      <w:proofErr w:type="gramEnd"/>
+      <w:r>
+        <w:rPr>
+          <w:b/>
+          <w:color w:val="000000" w:themeColor="text1"/>
+        </w:rPr>
+        <w:t xml:space="preserve"/>
+      </w:r>
+      <w:r>
+        <w:rPr>
+          <w:b/>
+          <w:color w:val="000000" w:themeColor="text1"/>
+        </w:rPr>
+        <w:t xml:space="preserve"/>
+      </w:r>
+      <w:r>
+        <w:rPr>
+          <w:b/>
           <w:color w:val="000000" w:themeColor="text1"/>
           <w:spacing w:val="-28"/>
         </w:rPr>
-        <w:t xml:space="preserve"> </w:t>
-      </w:r>
-      <w:r>
-        <w:rPr>
-          <w:color w:val="000000" w:themeColor="text1"/>
-        </w:rPr>
-        <w:t>PREVIAMENTE,</w:t>
-      </w:r>
-      <w:r>
-        <w:rPr>
-          <w:color w:val="000000" w:themeColor="text1"/>
-          <w:spacing w:val="-30"/>
-        </w:rPr>
-        <w:t xml:space="preserve"> </w:t>
-      </w:r>
-      <w:r>
-        <w:rPr>
-          <w:color w:val="000000" w:themeColor="text1"/>
-        </w:rPr>
-        <w:t>ES</w:t>
-      </w:r>
-      <w:r>
-        <w:rPr>
-          <w:color w:val="000000" w:themeColor="text1"/>
-          <w:spacing w:val="-30"/>
-        </w:rPr>
-        <w:t xml:space="preserve"> </w:t>
-      </w:r>
-      <w:r>
-        <w:rPr>
-          <w:color w:val="000000" w:themeColor="text1"/>
-        </w:rPr>
-        <w:t>REFERENCIAL Y ESTÁ SUJETA A VARIACIÓN Y/O MODIFICACIÓN SEGÚN REQUERIMIENTO DEL PROYECTO</w:t>
-      </w:r>
-      <w:r>
-        <w:rPr>
-          <w:color w:val="000000" w:themeColor="text1"/>
-          <w:spacing w:val="-9"/>
-        </w:rPr>
-        <w:t xml:space="preserve"> </w:t>
-      </w:r>
-      <w:r>
-        <w:rPr>
-          <w:color w:val="000000" w:themeColor="text1"/>
-        </w:rPr>
-        <w:t>Y/O</w:t>
-      </w:r>
-      <w:r>
-        <w:rPr>
-          <w:color w:val="000000" w:themeColor="text1"/>
-          <w:spacing w:val="-6"/>
-        </w:rPr>
-        <w:t xml:space="preserve"> </w:t>
-      </w:r>
-      <w:r>
-        <w:rPr>
-          <w:color w:val="000000" w:themeColor="text1"/>
-        </w:rPr>
-        <w:t>CERTIFICADO</w:t>
-      </w:r>
-      <w:r>
-        <w:rPr>
-          <w:color w:val="000000" w:themeColor="text1"/>
-          <w:spacing w:val="-7"/>
-        </w:rPr>
-        <w:t xml:space="preserve"> </w:t>
-      </w:r>
-      <w:r>
-        <w:rPr>
-          <w:color w:val="000000" w:themeColor="text1"/>
-        </w:rPr>
-        <w:t>DE</w:t>
-      </w:r>
-      <w:r>
-        <w:rPr>
-          <w:color w:val="000000" w:themeColor="text1"/>
-          <w:spacing w:val="-6"/>
-        </w:rPr>
-        <w:t xml:space="preserve"> </w:t>
-      </w:r>
-      <w:r>
-        <w:rPr>
-          <w:color w:val="000000" w:themeColor="text1"/>
-        </w:rPr>
-        <w:t>NUMERACIÓN</w:t>
-      </w:r>
-      <w:r>
-        <w:rPr>
-          <w:color w:val="000000" w:themeColor="text1"/>
-          <w:spacing w:val="-8"/>
-        </w:rPr>
-        <w:t xml:space="preserve"> </w:t>
-      </w:r>
-      <w:r>
-        <w:rPr>
-          <w:color w:val="000000" w:themeColor="text1"/>
-        </w:rPr>
-        <w:t>EMITIDO</w:t>
-      </w:r>
-      <w:r>
-        <w:rPr>
-          <w:color w:val="000000" w:themeColor="text1"/>
-          <w:spacing w:val="-8"/>
-        </w:rPr>
-        <w:t xml:space="preserve"> </w:t>
-      </w:r>
-      <w:r>
-        <w:rPr>
-          <w:color w:val="000000" w:themeColor="text1"/>
-        </w:rPr>
-        <w:t>POR</w:t>
-      </w:r>
-      <w:r>
-        <w:rPr>
-          <w:color w:val="000000" w:themeColor="text1"/>
-          <w:spacing w:val="-6"/>
-        </w:rPr>
-        <w:t xml:space="preserve"> </w:t>
-      </w:r>
-      <w:r>
-        <w:rPr>
-          <w:color w:val="000000" w:themeColor="text1"/>
-        </w:rPr>
-        <w:t>LA</w:t>
-      </w:r>
-      <w:r>
-        <w:rPr>
-          <w:color w:val="000000" w:themeColor="text1"/>
-          <w:spacing w:val="-9"/>
-        </w:rPr>
-        <w:t xml:space="preserve"> </w:t>
-      </w:r>
-      <w:r>
-        <w:rPr>
-          <w:color w:val="000000" w:themeColor="text1"/>
-        </w:rPr>
-        <w:t>MUNICIPALIDAD COMPETENTE,</w:t>
-      </w:r>
-      <w:r>
-        <w:rPr>
-          <w:color w:val="000000" w:themeColor="text1"/>
-          <w:spacing w:val="-30"/>
-        </w:rPr>
-        <w:t xml:space="preserve"> </w:t>
-      </w:r>
-      <w:r>
-        <w:rPr>
-          <w:color w:val="000000" w:themeColor="text1"/>
-        </w:rPr>
-        <w:t>CIRCUNSTANCIA</w:t>
-      </w:r>
-      <w:r>
-        <w:rPr>
-          <w:color w:val="000000" w:themeColor="text1"/>
-          <w:spacing w:val="-29"/>
-        </w:rPr>
-        <w:t xml:space="preserve"> </w:t>
-      </w:r>
-      <w:r>
-        <w:rPr>
-          <w:color w:val="000000" w:themeColor="text1"/>
-        </w:rPr>
-        <w:t>QUE</w:t>
-      </w:r>
-      <w:r>
-        <w:rPr>
-          <w:color w:val="000000" w:themeColor="text1"/>
-          <w:spacing w:val="-30"/>
-        </w:rPr>
-        <w:t xml:space="preserve"> </w:t>
-      </w:r>
-      <w:r>
-        <w:rPr>
-          <w:color w:val="000000" w:themeColor="text1"/>
-        </w:rPr>
-        <w:t>“</w:t>
-      </w:r>
-      <w:proofErr w:type="gramStart"/>
-      <w:r>
-        <w:rPr>
-          <w:b/>
-          <w:color w:val="000000" w:themeColor="text1"/>
-        </w:rPr>
-        <w:t>EL</w:t>
-      </w:r>
-      <w:r>
-        <w:rPr>
-          <w:b/>
-          <w:color w:val="000000" w:themeColor="text1"/>
-        </w:rPr>
-        <w:t xml:space="preserve"> </w:t>
-      </w:r>
-      <w:r>
-        <w:rPr>
-          <w:b/>
-          <w:color w:val="000000" w:themeColor="text1"/>
-        </w:rPr>
-        <w:t xml:space="preserve"> PROMINENTE</w:t>
-      </w:r>
-      <w:proofErr w:type="gramEnd"/>
-      <w:r>
-        <w:rPr>
-          <w:b/>
-          <w:color w:val="000000" w:themeColor="text1"/>
-        </w:rPr>
-        <w:t xml:space="preserve"> COMPRADOR</w:t>
-      </w:r>
-      <w:r>
-        <w:rPr>
-          <w:b/>
-          <w:color w:val="000000" w:themeColor="text1"/>
-        </w:rPr>
-        <w:t>”</w:t>
-      </w:r>
-      <w:r>
-        <w:rPr>
-          <w:b/>
-          <w:color w:val="000000" w:themeColor="text1"/>
-          <w:spacing w:val="-28"/>
-        </w:rPr>
-        <w:t xml:space="preserve"> </w:t>
-      </w:r>
-      <w:r>
-        <w:rPr>
-          <w:color w:val="000000" w:themeColor="text1"/>
-        </w:rPr>
-        <w:t>DECLARA CONOCER Y ACEPTAR ANTICIPADAMENTE.</w:t>
+        <w:t xml:space="preserve"/>
+      </w:r>
+      <w:r>
+        <w:rPr>
+          <w:color w:val="000000" w:themeColor="text1"/>
+        </w:rPr>
+        <w:t xml:space="preserve"> CONOCER Y ACEPTAR ANTICIPADAMENTE.</w:t>
       </w:r>
     </w:p>
     <w:p>
@@ -2129,7 +2129,7 @@
           <w:b/>
           <w:sz w:val="20"/>
         </w:rPr>
-        <w:t>3.1. LA SUMA DE S/ {{ inicial_monto }} ({{ inicial_monto_texto }} CON 00/100 SOLES), IMPORTE DE DINERO QUE "{{ comprador_denominacion }}" HA REALIZADO MEDIANTE DEPÓSITO A LA CUENTA DE "LA PROMITENTE VENDEDORA" N° {{ empresa_cuenta_bancaria }}, DEL {{ empresa_banco }}, CON FECHA {{ fecha_deposito }}, MEDIANTE NÚMERO DE OPERACIÓN {{ numero_operacion }}.</w:t>
+        <w:t xml:space="preserve">3.1. LA SUMA DE S/ {{ inicial_monto }} ({{ inicial_monto_texto }} CON 00/100 SOLES), IMPORTE DE DINERO QUE "{{ comprador_denominacion }}" HA{{ comprador_n }} REALIZADO MEDIANTE DEPÓSITO A LA CUENTA DE "LA PROMITENTE VENDEDORA" N° {{ empresa_cuenta_bancaria }}, DEL {{ empresa_banco }}, CON FECHA {{ fecha_deposito }}, MEDIANTE NÚMERO DE OPERACIÓN {{ numero_operacion }}.</w:t>
       </w:r>
     </w:p>
     <w:p>
@@ -2146,7 +2146,7 @@
         <w:rPr>
           <w:sz w:val="20"/>
         </w:rPr>
-        <w:t>MONTO QUE "{{ comprador_denominacion }}" CANCELARÁ {{ texto_intereses }} EN UN PLAZO DE {{ plazo_texto }}, ES DECIR CANCELARÁ COMO FECHA MÁXIMO EL {{ fecha_maxima_pago }}, CONCLUIDO CON EL PAGO, SE PROCEDERÁ CON LA FIRMA DE LA ESCRITURA PÚBLICA DE COMPRA VENTA DEL PREDIO DESCRITO EN LA CLAUSULA SEGUNDA. ASIMISMO, SI "{{ comprador_denominacion }}" NO CUMPLIERA CON PAGAR EL SALDO RESTANTE DENTRO DE LA FECHA PACTADA, DEBERÁ(N) ABONAR A LA EMPRESA INTERESES COMPENSATORIOS SOBRE EL MONTO DE LAS OBLIGACIONES VENCIDAS, SIN QUE SEA NECESARIA LA INTIMACIÓN PARA CONSTITUIRLO EN MORA, ASÍ COMO LAS COMISIONES DE COBRANZA QUE PUDIEREN GENERARSE EN ESTE SUPUESTO, AL DÍA DE REALIZACIÓN DEL PAGO. LOS INTERESES COMPENSATORIOS APLICABLES EN EL PRESENTE CASO SE CALCULARÁN APLICANDO UNA TASA EFECTIVA ANUAL DEL {{ tasa_interes_compensatorio }}%, AL VENCIMIENTO DEL PLAZO PARA EL PAGO, "{{ comprador_denominacion }}" RECONOCE QUE "LA PROMITENTE VENDEDORA" ESTÁ EN CONDICIONES DE REQUERIR EL PAGO. EN ESTE SENTIDO, "{{ comprador_denominacion }}" DECLARA ESTAR OBLIGADO(S) FRENTE A "LA PROMITENTE VENDEDORA", DESDE EL MISMO DÍA DE VENCIMIENTO DEL PAGO.</w:t>
+        <w:t xml:space="preserve">MONTO QUE "{{ comprador_denominacion }}" CANCELARÁ{{ comprador_n }} {{ texto_intereses }} EN UN PLAZO DE {{ plazo_texto }}, ES DECIR CANCELARÁ{{ comprador_n }} COMO FECHA MÁXIMO EL {{ fecha_maxima_pago }}, CONCLUIDO CON EL PAGO, SE PROCEDERÁ CON LA FIRMA DE LA ESCRITURA PÚBLICA DE COMPRA VENTA DEL PREDIO DESCRITO EN LA CLAUSULA SEGUNDA. ASIMISMO, SI "{{ comprador_denominacion }}" NO CUMPLIERA{{ comprador_n }} CON PAGAR EL SALDO RESTANTE DENTRO DE LA FECHA PACTADA, DEBERÁ{{ comprador_n }} ABONAR A LA EMPRESA INTERESES COMPENSATORIOS SOBRE EL MONTO DE LAS OBLIGACIONES VENCIDAS, SIN QUE SEA NECESARIA LA INTIMACIÓN PARA CONSTITUIRL{{ comprador_adj }} EN MORA, ASÍ COMO LAS COMISIONES DE COBRANZA QUE PUDIEREN GENERARSE EN ESTE SUPUESTO, AL DÍA DE REALIZACIÓN DEL PAGO. LOS INTERESES COMPENSATORIOS APLICABLES EN EL PRESENTE CASO SE CALCULARÁN APLICANDO UNA TASA EFECTIVA ANUAL DEL {{ tasa_interes_compensatorio }}%, AL VENCIMIENTO DEL PLAZO PARA EL PAGO, "{{ comprador_denominacion }}" RECONOCE{{ comprador_n }} QUE "LA PROMITENTE VENDEDORA" ESTÁ EN CONDICIONES DE REQUERIR EL PAGO. EN ESTE SENTIDO, "{{ comprador_denominacion }}" DECLARA{{ comprador_n }} ESTAR OBLIGAD{{ comprador_adj }} FRENTE A "LA PROMITENTE VENDEDORA", DESDE EL MISMO DÍA DE VENCIMIENTO DEL PAGO.</w:t>
       </w:r>
     </w:p>
     <w:p>
@@ -2247,34 +2247,34 @@
         <w:rPr>
           <w:color w:val="000000" w:themeColor="text1"/>
         </w:rPr>
-        <w:t>AL MOMENTO DE CELEBRAR EL PRESENTE CONTRATO, “</w:t>
-      </w:r>
-      <w:r>
-        <w:rPr>
-          <w:b/>
-          <w:color w:val="000000" w:themeColor="text1"/>
-        </w:rPr>
-        <w:t>EL</w:t>
-      </w:r>
-      <w:r>
-        <w:rPr>
-          <w:b/>
-          <w:color w:val="000000" w:themeColor="text1"/>
-        </w:rPr>
-        <w:t xml:space="preserve"> PROMINENTE COMPRADOR</w:t>
-      </w:r>
-      <w:r>
-        <w:rPr>
-          <w:b/>
-          <w:color w:val="000000" w:themeColor="text1"/>
-        </w:rPr>
-        <w:t xml:space="preserve">” </w:t>
-      </w:r>
-      <w:r>
-        <w:rPr>
-          <w:color w:val="000000" w:themeColor="text1"/>
-        </w:rPr>
-        <w:t>DECLARA EN FORMA EXPRESA TENER PERFECTO CONOCIMIENTO DEL ESTADO Y SITUACIÓN EN LA QUE SE ENCUENTRAN LOS TÍTULOS DE PROPIEDAD DE LOS INMUEBLES INDIVIDUALIZADOS EN LAS CLÁUSULAS PRIMERA Y SEGUNDA DE ESTE MISMO DOCUMENTO, COMO TAMBIÉN DE QUE NO EXISTE INSCRIPCIONES Y ANOTACIONES REGISTRALES SOBRE LOS MISMOS. QUEDA CLARA Y EXPRESAMENTE ESTABLECIDO</w:t>
+        <w:t xml:space="preserve">AL MOMENTO DE CELEBRAR EL PRESENTE CONTRATO, “{{ comprador_denominacion }}” DECLARA{{ comprador_n }}</w:t>
+      </w:r>
+      <w:r>
+        <w:rPr>
+          <w:b/>
+          <w:color w:val="000000" w:themeColor="text1"/>
+        </w:rPr>
+        <w:t/>
+      </w:r>
+      <w:r>
+        <w:rPr>
+          <w:b/>
+          <w:color w:val="000000" w:themeColor="text1"/>
+        </w:rPr>
+        <w:t xml:space="preserve"/>
+      </w:r>
+      <w:r>
+        <w:rPr>
+          <w:b/>
+          <w:color w:val="000000" w:themeColor="text1"/>
+        </w:rPr>
+        <w:t xml:space="preserve"/>
+      </w:r>
+      <w:r>
+        <w:rPr>
+          <w:color w:val="000000" w:themeColor="text1"/>
+        </w:rPr>
+        <w:t xml:space="preserve"> EN FORMA EXPRESA TENER PERFECTO CONOCIMIENTO DEL ESTADO Y SITUACIÓN EN LA QUE SE ENCUENTRAN LOS TÍTULOS DE PROPIEDAD DE LOS INMUEBLES INDIVIDUALIZADOS EN LAS CLÁUSULAS PRIMERA Y SEGUNDA DE ESTE MISMO DOCUMENTO, COMO TAMBIÉN DE QUE NO EXISTE INSCRIPCIONES Y ANOTACIONES REGISTRALES SOBRE LOS MISMOS. QUEDA CLARA Y EXPRESAMENTE ESTABLECIDO</w:t>
       </w:r>
       <w:r>
         <w:rPr>
@@ -2417,28 +2417,28 @@
         <w:rPr>
           <w:color w:val="000000" w:themeColor="text1"/>
         </w:rPr>
-        <w:t>“</w:t>
-      </w:r>
-      <w:r>
-        <w:rPr>
-          <w:b/>
-          <w:color w:val="000000" w:themeColor="text1"/>
-        </w:rPr>
-        <w:t xml:space="preserve">EL </w:t>
-      </w:r>
-      <w:r>
-        <w:rPr>
-          <w:b/>
-          <w:color w:val="000000" w:themeColor="text1"/>
-        </w:rPr>
-        <w:t xml:space="preserve"> PROMINENTE COMPRADOR</w:t>
-      </w:r>
-      <w:r>
-        <w:rPr>
-          <w:b/>
-          <w:color w:val="000000" w:themeColor="text1"/>
-        </w:rPr>
-        <w:t>”</w:t>
+        <w:t xml:space="preserve">“{{ comprador_denominacion }}”</w:t>
+      </w:r>
+      <w:r>
+        <w:rPr>
+          <w:b/>
+          <w:color w:val="000000" w:themeColor="text1"/>
+        </w:rPr>
+        <w:t xml:space="preserve"/>
+      </w:r>
+      <w:r>
+        <w:rPr>
+          <w:b/>
+          <w:color w:val="000000" w:themeColor="text1"/>
+        </w:rPr>
+        <w:t xml:space="preserve"/>
+      </w:r>
+      <w:r>
+        <w:rPr>
+          <w:b/>
+          <w:color w:val="000000" w:themeColor="text1"/>
+        </w:rPr>
+        <w:t xml:space="preserve"/>
       </w:r>
       <w:r>
         <w:rPr>
@@ -2704,53 +2704,53 @@
         <w:rPr>
           <w:color w:val="000000" w:themeColor="text1"/>
         </w:rPr>
-        <w:t>“</w:t>
-      </w:r>
-      <w:r>
-        <w:rPr>
-          <w:b/>
-          <w:color w:val="000000" w:themeColor="text1"/>
-        </w:rPr>
-        <w:t>EL</w:t>
-      </w:r>
-      <w:r>
-        <w:rPr>
-          <w:b/>
-          <w:color w:val="000000" w:themeColor="text1"/>
-        </w:rPr>
-        <w:t xml:space="preserve"> PROMINENTE COMPRADOR</w:t>
-      </w:r>
-      <w:r>
-        <w:rPr>
-          <w:b/>
-          <w:color w:val="000000" w:themeColor="text1"/>
-        </w:rPr>
-        <w:t>”</w:t>
-      </w:r>
-      <w:r>
-        <w:rPr>
-          <w:b/>
-          <w:color w:val="000000" w:themeColor="text1"/>
-        </w:rPr>
-        <w:t xml:space="preserve"> </w:t>
-      </w:r>
-      <w:r>
-        <w:rPr>
-          <w:color w:val="000000" w:themeColor="text1"/>
-        </w:rPr>
-        <w:t>PUEDA</w:t>
-      </w:r>
-      <w:r>
-        <w:rPr>
-          <w:color w:val="000000" w:themeColor="text1"/>
-        </w:rPr>
-        <w:t xml:space="preserve"> </w:t>
-      </w:r>
-      <w:r>
-        <w:rPr>
-          <w:color w:val="000000" w:themeColor="text1"/>
-        </w:rPr>
-        <w:t xml:space="preserve">RECIBIR DE </w:t>
+        <w:t xml:space="preserve">“{{ comprador_denominacion }}” PUEDA{{ comprador_n }} RECIBIR</w:t>
+      </w:r>
+      <w:r>
+        <w:rPr>
+          <w:b/>
+          <w:color w:val="000000" w:themeColor="text1"/>
+        </w:rPr>
+        <w:t/>
+      </w:r>
+      <w:r>
+        <w:rPr>
+          <w:b/>
+          <w:color w:val="000000" w:themeColor="text1"/>
+        </w:rPr>
+        <w:t xml:space="preserve"/>
+      </w:r>
+      <w:r>
+        <w:rPr>
+          <w:b/>
+          <w:color w:val="000000" w:themeColor="text1"/>
+        </w:rPr>
+        <w:t xml:space="preserve"/>
+      </w:r>
+      <w:r>
+        <w:rPr>
+          <w:b/>
+          <w:color w:val="000000" w:themeColor="text1"/>
+        </w:rPr>
+        <w:t xml:space="preserve"/>
+      </w:r>
+      <w:r>
+        <w:rPr>
+          <w:color w:val="000000" w:themeColor="text1"/>
+        </w:rPr>
+        <w:t/>
+      </w:r>
+      <w:r>
+        <w:rPr>
+          <w:color w:val="000000" w:themeColor="text1"/>
+        </w:rPr>
+        <w:t xml:space="preserve"/>
+      </w:r>
+      <w:r>
+        <w:rPr>
+          <w:color w:val="000000" w:themeColor="text1"/>
+        </w:rPr>
+        <w:t xml:space="preserve"> DE </w:t>
       </w:r>
       <w:r>
         <w:rPr>
@@ -2983,28 +2983,28 @@
         <w:rPr>
           <w:color w:val="000000" w:themeColor="text1"/>
         </w:rPr>
-        <w:t>“</w:t>
-      </w:r>
-      <w:r>
-        <w:rPr>
-          <w:b/>
-          <w:color w:val="000000" w:themeColor="text1"/>
-        </w:rPr>
-        <w:t>EL</w:t>
-      </w:r>
-      <w:r>
-        <w:rPr>
-          <w:b/>
-          <w:color w:val="000000" w:themeColor="text1"/>
-        </w:rPr>
-        <w:t xml:space="preserve"> PROMINENTE COMPRADOR</w:t>
-      </w:r>
-      <w:r>
-        <w:rPr>
-          <w:b/>
-          <w:color w:val="000000" w:themeColor="text1"/>
-        </w:rPr>
-        <w:t>”</w:t>
+        <w:t xml:space="preserve">“{{ comprador_denominacion }}”</w:t>
+      </w:r>
+      <w:r>
+        <w:rPr>
+          <w:b/>
+          <w:color w:val="000000" w:themeColor="text1"/>
+        </w:rPr>
+        <w:t/>
+      </w:r>
+      <w:r>
+        <w:rPr>
+          <w:b/>
+          <w:color w:val="000000" w:themeColor="text1"/>
+        </w:rPr>
+        <w:t xml:space="preserve"/>
+      </w:r>
+      <w:r>
+        <w:rPr>
+          <w:b/>
+          <w:color w:val="000000" w:themeColor="text1"/>
+        </w:rPr>
+        <w:t xml:space="preserve"/>
       </w:r>
       <w:r>
         <w:rPr>
@@ -3018,19 +3018,19 @@
         <w:rPr>
           <w:color w:val="000000" w:themeColor="text1"/>
         </w:rPr>
-        <w:t xml:space="preserve">CORRERÁ POR CUENTA DE </w:t>
-      </w:r>
-      <w:r>
-        <w:rPr>
-          <w:color w:val="000000" w:themeColor="text1"/>
-        </w:rPr>
-        <w:t>ESTE</w:t>
-      </w:r>
-      <w:r>
-        <w:rPr>
-          <w:color w:val="000000" w:themeColor="text1"/>
-        </w:rPr>
-        <w:t xml:space="preserve"> ÚLTIMO.</w:t>
+        <w:t xml:space="preserve">CORRERÁ POR CUENTA DE {{ comprador_este_ultimo }}.</w:t>
+      </w:r>
+      <w:r>
+        <w:rPr>
+          <w:color w:val="000000" w:themeColor="text1"/>
+        </w:rPr>
+        <w:t/>
+      </w:r>
+      <w:r>
+        <w:rPr>
+          <w:color w:val="000000" w:themeColor="text1"/>
+        </w:rPr>
+        <w:t xml:space="preserve"/>
       </w:r>
     </w:p>
     <w:p>
@@ -3068,34 +3068,34 @@
         <w:rPr>
           <w:color w:val="000000" w:themeColor="text1"/>
         </w:rPr>
-        <w:t>“</w:t>
-      </w:r>
-      <w:r>
-        <w:rPr>
-          <w:b/>
-          <w:color w:val="000000" w:themeColor="text1"/>
-        </w:rPr>
-        <w:t>EL</w:t>
-      </w:r>
-      <w:r>
-        <w:rPr>
-          <w:b/>
-          <w:color w:val="000000" w:themeColor="text1"/>
-        </w:rPr>
-        <w:t xml:space="preserve"> PROMINENTE COMPRADOR</w:t>
-      </w:r>
-      <w:r>
-        <w:rPr>
-          <w:b/>
-          <w:color w:val="000000" w:themeColor="text1"/>
-        </w:rPr>
-        <w:t xml:space="preserve">” </w:t>
-      </w:r>
-      <w:r>
-        <w:rPr>
-          <w:color w:val="000000" w:themeColor="text1"/>
-        </w:rPr>
-        <w:t xml:space="preserve">DECLARA TENER CONOCIMIENTO QUE EL INMUEBLE SE ENCUENTRA UBICADO EN UN PROYECTO DE HABILITACIÓN URBANA Y QUE EL PROYECTO INMOBILIARIO Y SUS LOTES CONFORMANTES CONTARÁN CON SERVICIOS BÁSICOS COMPLETOS (AGUA, LUZ Y </w:t>
+        <w:t xml:space="preserve">“{{ comprador_denominacion }}” DECLARA{{ comprador_n }}</w:t>
+      </w:r>
+      <w:r>
+        <w:rPr>
+          <w:b/>
+          <w:color w:val="000000" w:themeColor="text1"/>
+        </w:rPr>
+        <w:t/>
+      </w:r>
+      <w:r>
+        <w:rPr>
+          <w:b/>
+          <w:color w:val="000000" w:themeColor="text1"/>
+        </w:rPr>
+        <w:t xml:space="preserve"/>
+      </w:r>
+      <w:r>
+        <w:rPr>
+          <w:b/>
+          <w:color w:val="000000" w:themeColor="text1"/>
+        </w:rPr>
+        <w:t xml:space="preserve"/>
+      </w:r>
+      <w:r>
+        <w:rPr>
+          <w:color w:val="000000" w:themeColor="text1"/>
+        </w:rPr>
+        <w:t xml:space="preserve"> TENER CONOCIMIENTO QUE EL INMUEBLE SE ENCUENTRA UBICADO EN UN PROYECTO DE HABILITACIÓN URBANA Y QUE EL PROYECTO INMOBILIARIO Y SUS LOTES CONFORMANTES CONTARÁN CON SERVICIOS BÁSICOS COMPLETOS (AGUA, LUZ Y </w:t>
       </w:r>
       <w:r>
         <w:rPr>
@@ -3857,34 +3857,34 @@
           <w:sz w:val="20"/>
           <w:szCs w:val="20"/>
         </w:rPr>
-        <w:t>“</w:t>
-      </w:r>
-      <w:r>
-        <w:rPr>
-          <w:b/>
-          <w:color w:val="000000" w:themeColor="text1"/>
-          <w:sz w:val="20"/>
-          <w:szCs w:val="20"/>
-        </w:rPr>
-        <w:t>EL</w:t>
-      </w:r>
-      <w:r>
-        <w:rPr>
-          <w:b/>
-          <w:color w:val="000000" w:themeColor="text1"/>
-          <w:sz w:val="20"/>
-          <w:szCs w:val="20"/>
-        </w:rPr>
-        <w:t xml:space="preserve"> PROMINENTE COMPRADOR</w:t>
-      </w:r>
-      <w:r>
-        <w:rPr>
-          <w:b/>
-          <w:color w:val="000000" w:themeColor="text1"/>
-          <w:sz w:val="20"/>
-          <w:szCs w:val="20"/>
-        </w:rPr>
-        <w:t>”.</w:t>
+        <w:t xml:space="preserve">“{{ comprador_denominacion }}”</w:t>
+      </w:r>
+      <w:r>
+        <w:rPr>
+          <w:b/>
+          <w:color w:val="000000" w:themeColor="text1"/>
+          <w:sz w:val="20"/>
+          <w:szCs w:val="20"/>
+        </w:rPr>
+        <w:t/>
+      </w:r>
+      <w:r>
+        <w:rPr>
+          <w:b/>
+          <w:color w:val="000000" w:themeColor="text1"/>
+          <w:sz w:val="20"/>
+          <w:szCs w:val="20"/>
+        </w:rPr>
+        <w:t xml:space="preserve"/>
+      </w:r>
+      <w:r>
+        <w:rPr>
+          <w:b/>
+          <w:color w:val="000000" w:themeColor="text1"/>
+          <w:sz w:val="20"/>
+          <w:szCs w:val="20"/>
+        </w:rPr>
+        <w:t xml:space="preserve">.</w:t>
       </w:r>
     </w:p>
     <w:p>
@@ -4311,28 +4311,28 @@
         <w:rPr>
           <w:color w:val="000000" w:themeColor="text1"/>
         </w:rPr>
-        <w:t>“</w:t>
-      </w:r>
-      <w:r>
-        <w:rPr>
-          <w:b/>
-          <w:color w:val="000000" w:themeColor="text1"/>
-        </w:rPr>
-        <w:t>EL</w:t>
-      </w:r>
-      <w:r>
-        <w:rPr>
-          <w:b/>
-          <w:color w:val="000000" w:themeColor="text1"/>
-        </w:rPr>
-        <w:t xml:space="preserve"> PROMINENTE COMPRADOR</w:t>
-      </w:r>
-      <w:r>
-        <w:rPr>
-          <w:b/>
-          <w:color w:val="000000" w:themeColor="text1"/>
-        </w:rPr>
-        <w:t>”</w:t>
+        <w:t xml:space="preserve">“{{ comprador_denominacion }}” MANIFIESTA{{ comprador_n }} CONOCER</w:t>
+      </w:r>
+      <w:r>
+        <w:rPr>
+          <w:b/>
+          <w:color w:val="000000" w:themeColor="text1"/>
+        </w:rPr>
+        <w:t/>
+      </w:r>
+      <w:r>
+        <w:rPr>
+          <w:b/>
+          <w:color w:val="000000" w:themeColor="text1"/>
+        </w:rPr>
+        <w:t xml:space="preserve"/>
+      </w:r>
+      <w:r>
+        <w:rPr>
+          <w:b/>
+          <w:color w:val="000000" w:themeColor="text1"/>
+        </w:rPr>
+        <w:t xml:space="preserve"/>
       </w:r>
       <w:r>
         <w:rPr>
@@ -4340,26 +4340,26 @@
           <w:color w:val="000000" w:themeColor="text1"/>
           <w:spacing w:val="-7"/>
         </w:rPr>
-        <w:t xml:space="preserve"> </w:t>
-      </w:r>
-      <w:r>
-        <w:rPr>
-          <w:color w:val="000000" w:themeColor="text1"/>
-        </w:rPr>
-        <w:t>MANIFIESTA</w:t>
+        <w:t xml:space="preserve"/>
+      </w:r>
+      <w:r>
+        <w:rPr>
+          <w:color w:val="000000" w:themeColor="text1"/>
+        </w:rPr>
+        <w:t/>
       </w:r>
       <w:r>
         <w:rPr>
           <w:color w:val="000000" w:themeColor="text1"/>
           <w:spacing w:val="-9"/>
         </w:rPr>
-        <w:t xml:space="preserve"> </w:t>
-      </w:r>
-      <w:r>
-        <w:rPr>
-          <w:color w:val="000000" w:themeColor="text1"/>
-        </w:rPr>
-        <w:t>CONOCER Y ACEPTAR QUE EN CASO “</w:t>
+        <w:t xml:space="preserve"/>
+      </w:r>
+      <w:r>
+        <w:rPr>
+          <w:color w:val="000000" w:themeColor="text1"/>
+        </w:rPr>
+        <w:t xml:space="preserve"> Y ACEPTAR QUE EN CASO “</w:t>
       </w:r>
       <w:r>
         <w:rPr>
@@ -4502,46 +4502,46 @@
         <w:rPr>
           <w:color w:val="000000" w:themeColor="text1"/>
         </w:rPr>
-        <w:t>SE LE REMITIRÁ UNA COMUNICACIÓN A “</w:t>
-      </w:r>
-      <w:r>
-        <w:rPr>
-          <w:b/>
-          <w:color w:val="000000" w:themeColor="text1"/>
-        </w:rPr>
-        <w:t>EL</w:t>
-      </w:r>
-      <w:r>
-        <w:rPr>
-          <w:b/>
-          <w:color w:val="000000" w:themeColor="text1"/>
-        </w:rPr>
-        <w:t xml:space="preserve"> PROMINENTE COMPRADOR</w:t>
-      </w:r>
-      <w:r>
-        <w:rPr>
-          <w:b/>
-          <w:color w:val="000000" w:themeColor="text1"/>
-        </w:rPr>
-        <w:t xml:space="preserve">” </w:t>
-      </w:r>
-      <w:r>
-        <w:rPr>
-          <w:color w:val="000000" w:themeColor="text1"/>
-        </w:rPr>
-        <w:t>INFORMÁNDOLE</w:t>
-      </w:r>
-      <w:r>
-        <w:rPr>
-          <w:color w:val="000000" w:themeColor="text1"/>
-        </w:rPr>
-        <w:t xml:space="preserve"> </w:t>
-      </w:r>
-      <w:r>
-        <w:rPr>
-          <w:color w:val="000000" w:themeColor="text1"/>
-        </w:rPr>
-        <w:t>DEL CASO.</w:t>
+        <w:t xml:space="preserve">SE LE REMITIRÁ UNA COMUNICACIÓN A “{{ comprador_denominacion }}”</w:t>
+      </w:r>
+      <w:r>
+        <w:rPr>
+          <w:b/>
+          <w:color w:val="000000" w:themeColor="text1"/>
+        </w:rPr>
+        <w:t/>
+      </w:r>
+      <w:r>
+        <w:rPr>
+          <w:b/>
+          <w:color w:val="000000" w:themeColor="text1"/>
+        </w:rPr>
+        <w:t xml:space="preserve"/>
+      </w:r>
+      <w:r>
+        <w:rPr>
+          <w:b/>
+          <w:color w:val="000000" w:themeColor="text1"/>
+        </w:rPr>
+        <w:t xml:space="preserve"> </w:t>
+      </w:r>
+      <w:r>
+        <w:rPr>
+          <w:color w:val="000000" w:themeColor="text1"/>
+        </w:rPr>
+        <w:t xml:space="preserve">INFORMÁNDOLE{{ comprador_sufijo_plural }} DEL CASO</w:t>
+      </w:r>
+      <w:r>
+        <w:rPr>
+          <w:color w:val="000000" w:themeColor="text1"/>
+        </w:rPr>
+        <w:t xml:space="preserve"/>
+      </w:r>
+      <w:r>
+        <w:rPr>
+          <w:color w:val="000000" w:themeColor="text1"/>
+        </w:rPr>
+        <w:t xml:space="preserve">.</w:t>
       </w:r>
     </w:p>
     <w:p>
@@ -4672,28 +4672,28 @@
         <w:rPr>
           <w:color w:val="000000" w:themeColor="text1"/>
         </w:rPr>
-        <w:t>“</w:t>
-      </w:r>
-      <w:r>
-        <w:rPr>
-          <w:b/>
-          <w:color w:val="000000" w:themeColor="text1"/>
-        </w:rPr>
-        <w:t>EL</w:t>
-      </w:r>
-      <w:r>
-        <w:rPr>
-          <w:b/>
-          <w:color w:val="000000" w:themeColor="text1"/>
-        </w:rPr>
-        <w:t xml:space="preserve"> PROMINENTE COMPRADOR</w:t>
-      </w:r>
-      <w:r>
-        <w:rPr>
-          <w:b/>
-          <w:color w:val="000000" w:themeColor="text1"/>
-        </w:rPr>
-        <w:t>”</w:t>
+        <w:t xml:space="preserve">“{{ comprador_denominacion }}”</w:t>
+      </w:r>
+      <w:r>
+        <w:rPr>
+          <w:b/>
+          <w:color w:val="000000" w:themeColor="text1"/>
+        </w:rPr>
+        <w:t/>
+      </w:r>
+      <w:r>
+        <w:rPr>
+          <w:b/>
+          <w:color w:val="000000" w:themeColor="text1"/>
+        </w:rPr>
+        <w:t xml:space="preserve"/>
+      </w:r>
+      <w:r>
+        <w:rPr>
+          <w:b/>
+          <w:color w:val="000000" w:themeColor="text1"/>
+        </w:rPr>
+        <w:t xml:space="preserve"/>
       </w:r>
       <w:r>
         <w:rPr>
@@ -4727,123 +4727,227 @@
         <w:rPr>
           <w:color w:val="000000" w:themeColor="text1"/>
         </w:rPr>
-        <w:t>“</w:t>
-      </w:r>
-      <w:r>
-        <w:rPr>
-          <w:b/>
+        <w:t xml:space="preserve">“{{ comprador_denominacion }}”</w:t>
+      </w:r>
+      <w:r>
+        <w:rPr>
+          <w:b/>
+          <w:color w:val="000000" w:themeColor="text1"/>
+        </w:rPr>
+        <w:t/>
+      </w:r>
+      <w:r>
+        <w:rPr>
+          <w:b/>
+          <w:color w:val="000000" w:themeColor="text1"/>
+        </w:rPr>
+        <w:t xml:space="preserve"/>
+      </w:r>
+      <w:r>
+        <w:rPr>
+          <w:b/>
+          <w:color w:val="000000" w:themeColor="text1"/>
+        </w:rPr>
+        <w:t xml:space="preserve"/>
+      </w:r>
+      <w:r>
+        <w:rPr>
+          <w:b/>
+          <w:color w:val="000000" w:themeColor="text1"/>
+          <w:spacing w:val="-28"/>
+        </w:rPr>
+        <w:t xml:space="preserve"> </w:t>
+      </w:r>
+      <w:r>
+        <w:rPr>
+          <w:color w:val="000000" w:themeColor="text1"/>
+        </w:rPr>
+        <w:t xml:space="preserve">NO CONCURRIERA{{ comprador_n }}</w:t>
+      </w:r>
+      <w:r>
+        <w:rPr>
+          <w:color w:val="000000" w:themeColor="text1"/>
+          <w:spacing w:val="-30"/>
+        </w:rPr>
+        <w:t xml:space="preserve"/>
+      </w:r>
+      <w:r>
+        <w:rPr>
+          <w:color w:val="000000" w:themeColor="text1"/>
+        </w:rPr>
+        <w:t xml:space="preserve"/>
+      </w:r>
+      <w:r>
+        <w:rPr>
+          <w:color w:val="000000" w:themeColor="text1"/>
+          <w:spacing w:val="-30"/>
+        </w:rPr>
+        <w:t xml:space="preserve"> </w:t>
+      </w:r>
+      <w:r>
+        <w:rPr>
+          <w:color w:val="000000" w:themeColor="text1"/>
+        </w:rPr>
+        <w:t>A</w:t>
+      </w:r>
+      <w:r>
+        <w:rPr>
+          <w:color w:val="000000" w:themeColor="text1"/>
+          <w:spacing w:val="-30"/>
+        </w:rPr>
+        <w:t xml:space="preserve"> </w:t>
+      </w:r>
+      <w:r>
+        <w:rPr>
+          <w:color w:val="000000" w:themeColor="text1"/>
+        </w:rPr>
+        <w:t>LA</w:t>
+      </w:r>
+      <w:r>
+        <w:rPr>
+          <w:color w:val="000000" w:themeColor="text1"/>
+          <w:spacing w:val="-30"/>
+        </w:rPr>
+        <w:t xml:space="preserve"> </w:t>
+      </w:r>
+      <w:r>
+        <w:rPr>
+          <w:color w:val="000000" w:themeColor="text1"/>
+        </w:rPr>
+        <w:t>REUNIÓN,</w:t>
+      </w:r>
+      <w:r>
+        <w:rPr>
+          <w:color w:val="000000" w:themeColor="text1"/>
+          <w:spacing w:val="-28"/>
+        </w:rPr>
+        <w:t xml:space="preserve"> </w:t>
+      </w:r>
+      <w:r>
+        <w:rPr>
+          <w:color w:val="000000" w:themeColor="text1"/>
+        </w:rPr>
+        <w:t>PARA</w:t>
+      </w:r>
+      <w:r>
+        <w:rPr>
+          <w:color w:val="000000" w:themeColor="text1"/>
+          <w:spacing w:val="-30"/>
+        </w:rPr>
+        <w:t xml:space="preserve"> </w:t>
+      </w:r>
+      <w:r>
+        <w:rPr>
+          <w:color w:val="000000" w:themeColor="text1"/>
+        </w:rPr>
+        <w:t>TODOS LOS</w:t>
+      </w:r>
+      <w:r>
+        <w:rPr>
+          <w:color w:val="000000" w:themeColor="text1"/>
+          <w:spacing w:val="-18"/>
+        </w:rPr>
+        <w:t xml:space="preserve"> </w:t>
+      </w:r>
+      <w:r>
+        <w:rPr>
+          <w:color w:val="000000" w:themeColor="text1"/>
+        </w:rPr>
+        <w:t>EFECTOS</w:t>
+      </w:r>
+      <w:r>
+        <w:rPr>
+          <w:color w:val="000000" w:themeColor="text1"/>
+          <w:spacing w:val="-18"/>
+        </w:rPr>
+        <w:t xml:space="preserve"> </w:t>
+      </w:r>
+      <w:r>
+        <w:rPr>
+          <w:color w:val="000000" w:themeColor="text1"/>
+        </w:rPr>
+        <w:t>DEL</w:t>
+      </w:r>
+      <w:r>
+        <w:rPr>
+          <w:color w:val="000000" w:themeColor="text1"/>
+          <w:spacing w:val="-18"/>
+        </w:rPr>
+        <w:t xml:space="preserve"> </w:t>
+      </w:r>
+      <w:r>
+        <w:rPr>
+          <w:color w:val="000000" w:themeColor="text1"/>
+        </w:rPr>
+        <w:t>PRESENTE</w:t>
+      </w:r>
+      <w:r>
+        <w:rPr>
+          <w:color w:val="000000" w:themeColor="text1"/>
+          <w:spacing w:val="-18"/>
+        </w:rPr>
+        <w:t xml:space="preserve"> </w:t>
+      </w:r>
+      <w:r>
+        <w:rPr>
+          <w:color w:val="000000" w:themeColor="text1"/>
+        </w:rPr>
+        <w:t>CONTRATO</w:t>
+      </w:r>
+      <w:r>
+        <w:rPr>
+          <w:color w:val="000000" w:themeColor="text1"/>
+          <w:spacing w:val="-18"/>
+        </w:rPr>
+        <w:t xml:space="preserve"> </w:t>
+      </w:r>
+      <w:r>
+        <w:rPr>
+          <w:color w:val="000000" w:themeColor="text1"/>
+        </w:rPr>
+        <w:t>SE</w:t>
+      </w:r>
+      <w:r>
+        <w:rPr>
+          <w:color w:val="000000" w:themeColor="text1"/>
+          <w:spacing w:val="-18"/>
+        </w:rPr>
+        <w:t xml:space="preserve"> </w:t>
+      </w:r>
+      <w:r>
+        <w:rPr>
+          <w:color w:val="000000" w:themeColor="text1"/>
+        </w:rPr>
+        <w:t>CONSIDERARÁ</w:t>
+      </w:r>
+      <w:r>
+        <w:rPr>
+          <w:color w:val="000000" w:themeColor="text1"/>
+          <w:spacing w:val="-18"/>
+        </w:rPr>
+        <w:t xml:space="preserve"> </w:t>
+      </w:r>
+      <w:r>
+        <w:rPr>
+          <w:color w:val="000000" w:themeColor="text1"/>
+        </w:rPr>
+        <w:t>QUE</w:t>
+      </w:r>
+      <w:r>
+        <w:rPr>
+          <w:color w:val="000000" w:themeColor="text1"/>
+          <w:spacing w:val="-18"/>
+        </w:rPr>
+        <w:t xml:space="preserve"> </w:t>
+      </w:r>
+      <w:r>
+        <w:rPr>
           <w:color w:val="000000" w:themeColor="text1"/>
         </w:rPr>
         <w:t>EL</w:t>
       </w:r>
       <w:r>
         <w:rPr>
-          <w:b/>
-          <w:color w:val="000000" w:themeColor="text1"/>
-        </w:rPr>
-        <w:t xml:space="preserve"> PROMINENTE COMPRADOR</w:t>
-      </w:r>
-      <w:r>
-        <w:rPr>
-          <w:b/>
-          <w:color w:val="000000" w:themeColor="text1"/>
-        </w:rPr>
-        <w:t>”</w:t>
-      </w:r>
-      <w:r>
-        <w:rPr>
-          <w:b/>
-          <w:color w:val="000000" w:themeColor="text1"/>
-          <w:spacing w:val="-28"/>
-        </w:rPr>
-        <w:t xml:space="preserve"> </w:t>
-      </w:r>
-      <w:r>
-        <w:rPr>
-          <w:color w:val="000000" w:themeColor="text1"/>
-        </w:rPr>
-        <w:t>NO</w:t>
-      </w:r>
-      <w:r>
-        <w:rPr>
-          <w:color w:val="000000" w:themeColor="text1"/>
-          <w:spacing w:val="-30"/>
-        </w:rPr>
-        <w:t xml:space="preserve"> </w:t>
-      </w:r>
-      <w:r>
-        <w:rPr>
-          <w:color w:val="000000" w:themeColor="text1"/>
-        </w:rPr>
-        <w:t>CONCURRIERA</w:t>
-      </w:r>
-      <w:r>
-        <w:rPr>
-          <w:color w:val="000000" w:themeColor="text1"/>
-          <w:spacing w:val="-30"/>
-        </w:rPr>
-        <w:t xml:space="preserve"> </w:t>
-      </w:r>
-      <w:r>
-        <w:rPr>
-          <w:color w:val="000000" w:themeColor="text1"/>
-        </w:rPr>
-        <w:t>A</w:t>
-      </w:r>
-      <w:r>
-        <w:rPr>
-          <w:color w:val="000000" w:themeColor="text1"/>
-          <w:spacing w:val="-30"/>
-        </w:rPr>
-        <w:t xml:space="preserve"> </w:t>
-      </w:r>
-      <w:r>
-        <w:rPr>
-          <w:color w:val="000000" w:themeColor="text1"/>
-        </w:rPr>
-        <w:t>LA</w:t>
-      </w:r>
-      <w:r>
-        <w:rPr>
-          <w:color w:val="000000" w:themeColor="text1"/>
-          <w:spacing w:val="-30"/>
-        </w:rPr>
-        <w:t xml:space="preserve"> </w:t>
-      </w:r>
-      <w:r>
-        <w:rPr>
-          <w:color w:val="000000" w:themeColor="text1"/>
-        </w:rPr>
-        <w:t>REUNIÓN,</w:t>
-      </w:r>
-      <w:r>
-        <w:rPr>
-          <w:color w:val="000000" w:themeColor="text1"/>
-          <w:spacing w:val="-28"/>
-        </w:rPr>
-        <w:t xml:space="preserve"> </w:t>
-      </w:r>
-      <w:r>
-        <w:rPr>
-          <w:color w:val="000000" w:themeColor="text1"/>
-        </w:rPr>
-        <w:t>PARA</w:t>
-      </w:r>
-      <w:r>
-        <w:rPr>
-          <w:color w:val="000000" w:themeColor="text1"/>
-          <w:spacing w:val="-30"/>
-        </w:rPr>
-        <w:t xml:space="preserve"> </w:t>
-      </w:r>
-      <w:r>
-        <w:rPr>
-          <w:color w:val="000000" w:themeColor="text1"/>
-        </w:rPr>
-        <w:t>TODOS LOS</w:t>
-      </w:r>
-      <w:r>
-        <w:rPr>
           <w:color w:val="000000" w:themeColor="text1"/>
           <w:spacing w:val="-18"/>
         </w:rPr>
@@ -4853,7 +4957,7 @@
         <w:rPr>
           <w:color w:val="000000" w:themeColor="text1"/>
         </w:rPr>
-        <w:t>EFECTOS</w:t>
+        <w:t>INMUEBLE</w:t>
       </w:r>
       <w:r>
         <w:rPr>
@@ -4866,138 +4970,34 @@
         <w:rPr>
           <w:color w:val="000000" w:themeColor="text1"/>
         </w:rPr>
-        <w:t>DEL</w:t>
-      </w:r>
-      <w:r>
-        <w:rPr>
-          <w:color w:val="000000" w:themeColor="text1"/>
-          <w:spacing w:val="-18"/>
-        </w:rPr>
-        <w:t xml:space="preserve"> </w:t>
-      </w:r>
-      <w:r>
-        <w:rPr>
-          <w:color w:val="000000" w:themeColor="text1"/>
-        </w:rPr>
-        <w:t>PRESENTE</w:t>
-      </w:r>
-      <w:r>
-        <w:rPr>
-          <w:color w:val="000000" w:themeColor="text1"/>
-          <w:spacing w:val="-18"/>
-        </w:rPr>
-        <w:t xml:space="preserve"> </w:t>
-      </w:r>
-      <w:r>
-        <w:rPr>
-          <w:color w:val="000000" w:themeColor="text1"/>
-        </w:rPr>
-        <w:t>CONTRATO</w:t>
-      </w:r>
-      <w:r>
-        <w:rPr>
-          <w:color w:val="000000" w:themeColor="text1"/>
-          <w:spacing w:val="-18"/>
-        </w:rPr>
-        <w:t xml:space="preserve"> </w:t>
-      </w:r>
-      <w:r>
-        <w:rPr>
-          <w:color w:val="000000" w:themeColor="text1"/>
-        </w:rPr>
-        <w:t>SE</w:t>
-      </w:r>
-      <w:r>
-        <w:rPr>
-          <w:color w:val="000000" w:themeColor="text1"/>
-          <w:spacing w:val="-18"/>
-        </w:rPr>
-        <w:t xml:space="preserve"> </w:t>
-      </w:r>
-      <w:r>
-        <w:rPr>
-          <w:color w:val="000000" w:themeColor="text1"/>
-        </w:rPr>
-        <w:t>CONSIDERARÁ</w:t>
-      </w:r>
-      <w:r>
-        <w:rPr>
-          <w:color w:val="000000" w:themeColor="text1"/>
-          <w:spacing w:val="-18"/>
-        </w:rPr>
-        <w:t xml:space="preserve"> </w:t>
-      </w:r>
-      <w:r>
-        <w:rPr>
-          <w:color w:val="000000" w:themeColor="text1"/>
-        </w:rPr>
-        <w:t>QUE</w:t>
-      </w:r>
-      <w:r>
-        <w:rPr>
-          <w:color w:val="000000" w:themeColor="text1"/>
-          <w:spacing w:val="-18"/>
-        </w:rPr>
-        <w:t xml:space="preserve"> </w:t>
-      </w:r>
-      <w:r>
-        <w:rPr>
-          <w:color w:val="000000" w:themeColor="text1"/>
-        </w:rPr>
-        <w:t>EL</w:t>
-      </w:r>
-      <w:r>
-        <w:rPr>
-          <w:color w:val="000000" w:themeColor="text1"/>
-          <w:spacing w:val="-18"/>
-        </w:rPr>
-        <w:t xml:space="preserve"> </w:t>
-      </w:r>
-      <w:r>
-        <w:rPr>
-          <w:color w:val="000000" w:themeColor="text1"/>
-        </w:rPr>
-        <w:t>INMUEBLE</w:t>
-      </w:r>
-      <w:r>
-        <w:rPr>
-          <w:color w:val="000000" w:themeColor="text1"/>
-          <w:spacing w:val="-18"/>
-        </w:rPr>
-        <w:t xml:space="preserve"> </w:t>
-      </w:r>
-      <w:r>
-        <w:rPr>
-          <w:color w:val="000000" w:themeColor="text1"/>
-        </w:rPr>
-        <w:t>MATERIA DEL MISMO HA SIDO DEBIDAMENTE ENTREGADO POR LA EMPRESA Y RECIBIDO POR “</w:t>
-      </w:r>
-      <w:r>
-        <w:rPr>
-          <w:b/>
-          <w:color w:val="000000" w:themeColor="text1"/>
-        </w:rPr>
-        <w:t>EL</w:t>
-      </w:r>
-      <w:r>
-        <w:rPr>
-          <w:b/>
-          <w:color w:val="000000" w:themeColor="text1"/>
-        </w:rPr>
-        <w:t xml:space="preserve"> PROMINENTE COMPRADOR</w:t>
-      </w:r>
-      <w:r>
-        <w:rPr>
-          <w:b/>
-          <w:color w:val="000000" w:themeColor="text1"/>
-        </w:rPr>
-        <w:t xml:space="preserve">” </w:t>
-      </w:r>
-      <w:r>
-        <w:rPr>
-          <w:color w:val="000000" w:themeColor="text1"/>
-        </w:rPr>
-        <w:t>CONFORME A LO PACTADO EN LA PRESENTE CLÁUSULA Y QUE ÉSTE ÚLTIMO HA OTORGADO SU PLENA Y ABSOLUTA CONFORMIDAD A DICHA ENTREGA.</w:t>
+        <w:t xml:space="preserve">MATERIA DEL MISMO HA SIDO DEBIDAMENTE ENTREGADO POR LA EMPRESA Y RECIBIDO POR “{{ comprador_denominacion }}”</w:t>
+      </w:r>
+      <w:r>
+        <w:rPr>
+          <w:b/>
+          <w:color w:val="000000" w:themeColor="text1"/>
+        </w:rPr>
+        <w:t/>
+      </w:r>
+      <w:r>
+        <w:rPr>
+          <w:b/>
+          <w:color w:val="000000" w:themeColor="text1"/>
+        </w:rPr>
+        <w:t xml:space="preserve"/>
+      </w:r>
+      <w:r>
+        <w:rPr>
+          <w:b/>
+          <w:color w:val="000000" w:themeColor="text1"/>
+        </w:rPr>
+        <w:t xml:space="preserve"> </w:t>
+      </w:r>
+      <w:r>
+        <w:rPr>
+          <w:color w:val="000000" w:themeColor="text1"/>
+        </w:rPr>
+        <w:t xml:space="preserve">CONFORME A LO PACTADO EN LA PRESENTE CLÁUSULA Y QUE {{ comprador_este_ultimo }} HA{{ comprador_n }} OTORGADO SU PLENA Y ABSOLUTA CONFORMIDAD A DICHA ENTREGA.</w:t>
       </w:r>
     </w:p>
     <w:p>
@@ -5040,34 +5040,34 @@
           <w:sz w:val="20"/>
           <w:szCs w:val="20"/>
         </w:rPr>
-        <w:t>“</w:t>
-      </w:r>
-      <w:r>
-        <w:rPr>
-          <w:b/>
-          <w:color w:val="000000" w:themeColor="text1"/>
-          <w:sz w:val="20"/>
-          <w:szCs w:val="20"/>
-        </w:rPr>
-        <w:t>EL</w:t>
-      </w:r>
-      <w:r>
-        <w:rPr>
-          <w:b/>
-          <w:color w:val="000000" w:themeColor="text1"/>
-          <w:sz w:val="20"/>
-          <w:szCs w:val="20"/>
-        </w:rPr>
-        <w:t xml:space="preserve"> PROMINENTE COMPRADOR</w:t>
-      </w:r>
-      <w:r>
-        <w:rPr>
-          <w:b/>
-          <w:color w:val="000000" w:themeColor="text1"/>
-          <w:sz w:val="20"/>
-          <w:szCs w:val="20"/>
-        </w:rPr>
-        <w:t>”</w:t>
+        <w:t xml:space="preserve">“{{ comprador_denominacion }}” DECLARA{{ comprador_n }}</w:t>
+      </w:r>
+      <w:r>
+        <w:rPr>
+          <w:b/>
+          <w:color w:val="000000" w:themeColor="text1"/>
+          <w:sz w:val="20"/>
+          <w:szCs w:val="20"/>
+        </w:rPr>
+        <w:t/>
+      </w:r>
+      <w:r>
+        <w:rPr>
+          <w:b/>
+          <w:color w:val="000000" w:themeColor="text1"/>
+          <w:sz w:val="20"/>
+          <w:szCs w:val="20"/>
+        </w:rPr>
+        <w:t xml:space="preserve"/>
+      </w:r>
+      <w:r>
+        <w:rPr>
+          <w:b/>
+          <w:color w:val="000000" w:themeColor="text1"/>
+          <w:sz w:val="20"/>
+          <w:szCs w:val="20"/>
+        </w:rPr>
+        <w:t xml:space="preserve"/>
       </w:r>
       <w:r>
         <w:rPr>
@@ -5077,15 +5077,15 @@
           <w:sz w:val="20"/>
           <w:szCs w:val="20"/>
         </w:rPr>
-        <w:t xml:space="preserve"> </w:t>
-      </w:r>
-      <w:r>
-        <w:rPr>
-          <w:color w:val="000000" w:themeColor="text1"/>
-          <w:sz w:val="20"/>
-          <w:szCs w:val="20"/>
-        </w:rPr>
-        <w:t>DECLARA</w:t>
+        <w:t xml:space="preserve"/>
+      </w:r>
+      <w:r>
+        <w:rPr>
+          <w:color w:val="000000" w:themeColor="text1"/>
+          <w:sz w:val="20"/>
+          <w:szCs w:val="20"/>
+        </w:rPr>
+        <w:t xml:space="preserve"/>
       </w:r>
       <w:r>
         <w:rPr>
@@ -5915,21 +5915,21 @@
           <w:bCs/>
           <w:color w:val="000000" w:themeColor="text1"/>
         </w:rPr>
-        <w:t>“</w:t>
-      </w:r>
-      <w:r>
-        <w:rPr>
-          <w:b/>
-          <w:color w:val="000000" w:themeColor="text1"/>
-        </w:rPr>
-        <w:t>EL</w:t>
-      </w:r>
-      <w:r>
-        <w:rPr>
-          <w:b/>
-          <w:color w:val="000000" w:themeColor="text1"/>
-        </w:rPr>
-        <w:t xml:space="preserve"> PROMINENTE COMPRADOR</w:t>
+        <w:t xml:space="preserve">“{{ comprador_denominacion }}” OTORGA{{ comprador_n }} SU CONSENTIMIENTO</w:t>
+      </w:r>
+      <w:r>
+        <w:rPr>
+          <w:b/>
+          <w:color w:val="000000" w:themeColor="text1"/>
+        </w:rPr>
+        <w:t/>
+      </w:r>
+      <w:r>
+        <w:rPr>
+          <w:b/>
+          <w:color w:val="000000" w:themeColor="text1"/>
+        </w:rPr>
+        <w:t xml:space="preserve"/>
       </w:r>
       <w:r>
         <w:rPr>
@@ -5937,13 +5937,13 @@
           <w:bCs/>
           <w:color w:val="000000" w:themeColor="text1"/>
         </w:rPr>
-        <w:t>”</w:t>
-      </w:r>
-      <w:r>
-        <w:rPr>
-          <w:color w:val="000000" w:themeColor="text1"/>
-        </w:rPr>
-        <w:t xml:space="preserve"> OTORGA SU CONSENTIMIENTO LIBRE, PREVIO, EXPRESO, INFORMADO E INEQUÍVOCO, PARA EL TRATAMIENTO DE SUS DATOS PERSONALES,</w:t>
+        <w:t xml:space="preserve"/>
+      </w:r>
+      <w:r>
+        <w:rPr>
+          <w:color w:val="000000" w:themeColor="text1"/>
+        </w:rPr>
+        <w:t xml:space="preserve"> LIBRE, PREVIO, EXPRESO, INFORMADO E INEQUÍVOCO, PARA EL TRATAMIENTO DE SUS DATOS PERSONALES,</w:t>
       </w:r>
       <w:r>
         <w:rPr>
@@ -7900,14 +7900,14 @@
           <w:color w:val="000000" w:themeColor="text1"/>
           <w:spacing w:val="-2"/>
         </w:rPr>
-        <w:t>EL</w:t>
+        <w:t xml:space="preserve">{{ comprador_denominacion }}</w:t>
       </w:r>
       <w:r>
         <w:rPr>
           <w:color w:val="000000" w:themeColor="text1"/>
           <w:spacing w:val="-2"/>
         </w:rPr>
-        <w:t xml:space="preserve"> PROMINENTE COMPRADOR</w:t>
+        <w:t xml:space="preserve"/>
       </w:r>
       <w:r>
         <w:rPr>

</xml_diff>